<commit_message>
added BTP and other projects text
</commit_message>
<xml_diff>
--- a/Prateek Rastogi-Current.docx
+++ b/Prateek Rastogi-Current.docx
@@ -389,32 +389,13 @@
         </w:rPr>
         <w:t xml:space="preserve"> </w:t>
       </w:r>
-      <w:proofErr w:type="spellStart"/>
-      <w:r>
-        <w:rPr>
-          <w:rFonts w:asciiTheme="majorHAnsi" w:eastAsia="MS Mincho" w:hAnsiTheme="majorHAnsi"/>
-          <w:sz w:val="24"/>
-          <w:szCs w:val="24"/>
-        </w:rPr>
-        <w:t>Peptech</w:t>
-      </w:r>
-      <w:proofErr w:type="spellEnd"/>
-      <w:r>
-        <w:rPr>
-          <w:rFonts w:asciiTheme="majorHAnsi" w:eastAsia="MS Mincho" w:hAnsiTheme="majorHAnsi"/>
-          <w:sz w:val="24"/>
-          <w:szCs w:val="24"/>
-        </w:rPr>
-        <w:t xml:space="preserve"> </w:t>
-      </w:r>
-      <w:proofErr w:type="gramStart"/>
-      <w:r>
-        <w:rPr>
-          <w:rFonts w:asciiTheme="majorHAnsi" w:eastAsia="MS Mincho" w:hAnsiTheme="majorHAnsi"/>
-          <w:sz w:val="24"/>
-          <w:szCs w:val="24"/>
-        </w:rPr>
-        <w:t>City</w:t>
+      <w:r>
+        <w:rPr>
+          <w:rFonts w:asciiTheme="majorHAnsi" w:eastAsia="MS Mincho" w:hAnsiTheme="majorHAnsi"/>
+          <w:sz w:val="24"/>
+          <w:szCs w:val="24"/>
+        </w:rPr>
+        <w:t>Peptech City</w:t>
       </w:r>
       <w:r>
         <w:rPr>
@@ -438,16 +419,7 @@
           <w:sz w:val="24"/>
           <w:szCs w:val="24"/>
         </w:rPr>
-        <w:t xml:space="preserve"> </w:t>
-      </w:r>
-      <w:proofErr w:type="gramEnd"/>
-      <w:r>
-        <w:rPr>
-          <w:rFonts w:asciiTheme="majorHAnsi" w:eastAsia="MS Mincho" w:hAnsiTheme="majorHAnsi"/>
-          <w:sz w:val="24"/>
-          <w:szCs w:val="24"/>
-        </w:rPr>
-        <w:t xml:space="preserve">   </w:t>
+        <w:t xml:space="preserve">    </w:t>
       </w:r>
       <w:r>
         <w:rPr>
@@ -574,7 +546,6 @@
         </w:rPr>
         <w:t xml:space="preserve">      </w:t>
       </w:r>
-      <w:proofErr w:type="spellStart"/>
       <w:r>
         <w:rPr>
           <w:rFonts w:asciiTheme="majorHAnsi" w:eastAsia="MS Mincho" w:hAnsiTheme="majorHAnsi"/>
@@ -591,7 +562,6 @@
         </w:rPr>
         <w:t>ohawal</w:t>
       </w:r>
-      <w:proofErr w:type="spellEnd"/>
       <w:r>
         <w:rPr>
           <w:rFonts w:asciiTheme="majorHAnsi" w:eastAsia="MS Mincho" w:hAnsiTheme="majorHAnsi"/>
@@ -720,7 +690,6 @@
         </w:rPr>
         <w:t xml:space="preserve">      </w:t>
       </w:r>
-      <w:proofErr w:type="gramStart"/>
       <w:r>
         <w:rPr>
           <w:rFonts w:asciiTheme="majorHAnsi" w:eastAsia="MS Mincho" w:hAnsiTheme="majorHAnsi"/>
@@ -737,7 +706,6 @@
         </w:rPr>
         <w:t xml:space="preserve">  </w:t>
       </w:r>
-      <w:proofErr w:type="gramEnd"/>
       <w:r>
         <w:rPr>
           <w:rFonts w:asciiTheme="majorHAnsi" w:eastAsia="MS Mincho" w:hAnsiTheme="majorHAnsi"/>
@@ -1367,7 +1335,23 @@
           <w:sz w:val="24"/>
           <w:szCs w:val="24"/>
         </w:rPr>
-        <w:t xml:space="preserve"> (Human</w:t>
+        <w:t xml:space="preserve"> </w:t>
+      </w:r>
+      <w:r>
+        <w:rPr>
+          <w:rFonts w:asciiTheme="majorHAnsi" w:eastAsia="MS Mincho" w:hAnsiTheme="majorHAnsi"/>
+          <w:sz w:val="24"/>
+          <w:szCs w:val="24"/>
+        </w:rPr>
+        <w:t xml:space="preserve">in </w:t>
+      </w:r>
+      <w:r>
+        <w:rPr>
+          <w:rFonts w:asciiTheme="majorHAnsi" w:eastAsia="MS Mincho" w:hAnsiTheme="majorHAnsi"/>
+          <w:sz w:val="24"/>
+          <w:szCs w:val="24"/>
+        </w:rPr>
+        <w:t>Human</w:t>
       </w:r>
       <w:r>
         <w:rPr>
@@ -1383,7 +1367,7 @@
           <w:sz w:val="24"/>
           <w:szCs w:val="24"/>
         </w:rPr>
-        <w:t>Computer Interaction)</w:t>
+        <w:t>Computer Interaction</w:t>
       </w:r>
       <w:r>
         <w:rPr>
@@ -1421,6 +1405,707 @@
           <w:szCs w:val="24"/>
         </w:rPr>
       </w:pPr>
+    </w:p>
+    <w:p>
+      <w:pPr>
+        <w:pStyle w:val="JobTitlebold"/>
+        <w:ind w:left="1080"/>
+        <w:rPr>
+          <w:rFonts w:asciiTheme="minorHAnsi" w:eastAsia="MS Mincho" w:hAnsiTheme="minorHAnsi" w:cstheme="minorHAnsi"/>
+          <w:b w:val="0"/>
+          <w:bCs w:val="0"/>
+          <w:sz w:val="24"/>
+          <w:szCs w:val="24"/>
+        </w:rPr>
+      </w:pPr>
+      <w:r>
+        <w:rPr>
+          <w:rFonts w:asciiTheme="minorHAnsi" w:eastAsia="MS Mincho" w:hAnsiTheme="minorHAnsi" w:cstheme="minorHAnsi"/>
+          <w:b w:val="0"/>
+          <w:bCs w:val="0"/>
+          <w:sz w:val="24"/>
+          <w:szCs w:val="24"/>
+        </w:rPr>
+        <w:t xml:space="preserve">Pursued undergraduate </w:t>
+      </w:r>
+      <w:r>
+        <w:rPr>
+          <w:rFonts w:asciiTheme="minorHAnsi" w:eastAsia="MS Mincho" w:hAnsiTheme="minorHAnsi" w:cstheme="minorHAnsi"/>
+          <w:b w:val="0"/>
+          <w:bCs w:val="0"/>
+          <w:sz w:val="24"/>
+          <w:szCs w:val="24"/>
+        </w:rPr>
+        <w:t xml:space="preserve">dissertation </w:t>
+      </w:r>
+      <w:r>
+        <w:rPr>
+          <w:rFonts w:asciiTheme="minorHAnsi" w:eastAsia="MS Mincho" w:hAnsiTheme="minorHAnsi" w:cstheme="minorHAnsi"/>
+          <w:b w:val="0"/>
+          <w:bCs w:val="0"/>
+          <w:sz w:val="24"/>
+          <w:szCs w:val="24"/>
+        </w:rPr>
+        <w:t>emphasiz</w:t>
+      </w:r>
+      <w:r>
+        <w:rPr>
+          <w:rFonts w:asciiTheme="minorHAnsi" w:eastAsia="MS Mincho" w:hAnsiTheme="minorHAnsi" w:cstheme="minorHAnsi"/>
+          <w:b w:val="0"/>
+          <w:bCs w:val="0"/>
+          <w:sz w:val="24"/>
+          <w:szCs w:val="24"/>
+        </w:rPr>
+        <w:t>ed</w:t>
+      </w:r>
+      <w:r>
+        <w:rPr>
+          <w:rFonts w:asciiTheme="minorHAnsi" w:eastAsia="MS Mincho" w:hAnsiTheme="minorHAnsi" w:cstheme="minorHAnsi"/>
+          <w:b w:val="0"/>
+          <w:bCs w:val="0"/>
+          <w:sz w:val="24"/>
+          <w:szCs w:val="24"/>
+        </w:rPr>
+        <w:t xml:space="preserve"> on</w:t>
+      </w:r>
+      <w:r>
+        <w:rPr>
+          <w:rFonts w:asciiTheme="minorHAnsi" w:eastAsia="MS Mincho" w:hAnsiTheme="minorHAnsi" w:cstheme="minorHAnsi"/>
+          <w:b w:val="0"/>
+          <w:bCs w:val="0"/>
+          <w:sz w:val="24"/>
+          <w:szCs w:val="24"/>
+        </w:rPr>
+        <w:t xml:space="preserve"> </w:t>
+      </w:r>
+      <w:r>
+        <w:rPr>
+          <w:rFonts w:asciiTheme="minorHAnsi" w:eastAsia="MS Mincho" w:hAnsiTheme="minorHAnsi" w:cstheme="minorHAnsi"/>
+          <w:b w:val="0"/>
+          <w:bCs w:val="0"/>
+          <w:sz w:val="24"/>
+          <w:szCs w:val="24"/>
+        </w:rPr>
+        <w:t xml:space="preserve">the </w:t>
+      </w:r>
+      <w:r>
+        <w:rPr>
+          <w:rFonts w:asciiTheme="minorHAnsi" w:eastAsia="MS Mincho" w:hAnsiTheme="minorHAnsi" w:cstheme="minorHAnsi"/>
+          <w:b w:val="0"/>
+          <w:bCs w:val="0"/>
+          <w:sz w:val="24"/>
+          <w:szCs w:val="24"/>
+        </w:rPr>
+        <w:t>develop</w:t>
+      </w:r>
+      <w:r>
+        <w:rPr>
+          <w:rFonts w:asciiTheme="minorHAnsi" w:eastAsia="MS Mincho" w:hAnsiTheme="minorHAnsi" w:cstheme="minorHAnsi"/>
+          <w:b w:val="0"/>
+          <w:bCs w:val="0"/>
+          <w:sz w:val="24"/>
+          <w:szCs w:val="24"/>
+        </w:rPr>
+        <w:t>ment of</w:t>
+      </w:r>
+      <w:r>
+        <w:rPr>
+          <w:rFonts w:asciiTheme="minorHAnsi" w:eastAsia="MS Mincho" w:hAnsiTheme="minorHAnsi" w:cstheme="minorHAnsi"/>
+          <w:b w:val="0"/>
+          <w:bCs w:val="0"/>
+          <w:sz w:val="24"/>
+          <w:szCs w:val="24"/>
+        </w:rPr>
+        <w:t xml:space="preserve"> an attention model predicting the human eye fixation sequence</w:t>
+      </w:r>
+      <w:r>
+        <w:rPr>
+          <w:rFonts w:asciiTheme="minorHAnsi" w:eastAsia="MS Mincho" w:hAnsiTheme="minorHAnsi" w:cstheme="minorHAnsi"/>
+          <w:b w:val="0"/>
+          <w:bCs w:val="0"/>
+          <w:sz w:val="24"/>
+          <w:szCs w:val="24"/>
+        </w:rPr>
+        <w:t xml:space="preserve"> </w:t>
+      </w:r>
+      <w:r>
+        <w:rPr>
+          <w:rFonts w:asciiTheme="minorHAnsi" w:eastAsia="MS Mincho" w:hAnsiTheme="minorHAnsi" w:cstheme="minorHAnsi"/>
+          <w:b w:val="0"/>
+          <w:bCs w:val="0"/>
+          <w:sz w:val="24"/>
+          <w:szCs w:val="24"/>
+        </w:rPr>
+        <w:t>on a</w:t>
+      </w:r>
+      <w:r>
+        <w:rPr>
+          <w:rFonts w:asciiTheme="minorHAnsi" w:eastAsia="MS Mincho" w:hAnsiTheme="minorHAnsi" w:cstheme="minorHAnsi"/>
+          <w:b w:val="0"/>
+          <w:bCs w:val="0"/>
+          <w:sz w:val="24"/>
+          <w:szCs w:val="24"/>
+        </w:rPr>
+        <w:t xml:space="preserve"> spontaneous</w:t>
+      </w:r>
+      <w:r>
+        <w:rPr>
+          <w:rFonts w:asciiTheme="minorHAnsi" w:eastAsia="MS Mincho" w:hAnsiTheme="minorHAnsi" w:cstheme="minorHAnsi"/>
+          <w:b w:val="0"/>
+          <w:bCs w:val="0"/>
+          <w:sz w:val="24"/>
+          <w:szCs w:val="24"/>
+        </w:rPr>
+        <w:t xml:space="preserve"> webpage.</w:t>
+      </w:r>
+      <w:r>
+        <w:rPr>
+          <w:rFonts w:asciiTheme="minorHAnsi" w:eastAsia="MS Mincho" w:hAnsiTheme="minorHAnsi" w:cstheme="minorHAnsi"/>
+          <w:b w:val="0"/>
+          <w:bCs w:val="0"/>
+          <w:sz w:val="24"/>
+          <w:szCs w:val="24"/>
+        </w:rPr>
+        <w:t xml:space="preserve"> </w:t>
+      </w:r>
+      <w:r>
+        <w:rPr>
+          <w:rFonts w:asciiTheme="minorHAnsi" w:eastAsia="MS Mincho" w:hAnsiTheme="minorHAnsi" w:cstheme="minorHAnsi"/>
+          <w:b w:val="0"/>
+          <w:bCs w:val="0"/>
+          <w:sz w:val="24"/>
+          <w:szCs w:val="24"/>
+        </w:rPr>
+        <w:t xml:space="preserve">For this, we divided the </w:t>
+      </w:r>
+      <w:r>
+        <w:rPr>
+          <w:rFonts w:asciiTheme="minorHAnsi" w:eastAsia="MS Mincho" w:hAnsiTheme="minorHAnsi" w:cstheme="minorHAnsi"/>
+          <w:b w:val="0"/>
+          <w:bCs w:val="0"/>
+          <w:sz w:val="24"/>
+          <w:szCs w:val="24"/>
+        </w:rPr>
+        <w:t>contents of a webpage into logically grouped cohesive information regions termed as “web objects”</w:t>
+      </w:r>
+      <w:r>
+        <w:rPr>
+          <w:rFonts w:asciiTheme="minorHAnsi" w:eastAsia="MS Mincho" w:hAnsiTheme="minorHAnsi" w:cstheme="minorHAnsi"/>
+          <w:b w:val="0"/>
+          <w:bCs w:val="0"/>
+          <w:sz w:val="24"/>
+          <w:szCs w:val="24"/>
+        </w:rPr>
+        <w:t>,</w:t>
+      </w:r>
+      <w:r>
+        <w:rPr>
+          <w:rFonts w:asciiTheme="minorHAnsi" w:eastAsia="MS Mincho" w:hAnsiTheme="minorHAnsi" w:cstheme="minorHAnsi"/>
+          <w:b w:val="0"/>
+          <w:bCs w:val="0"/>
+          <w:sz w:val="24"/>
+          <w:szCs w:val="24"/>
+        </w:rPr>
+        <w:t xml:space="preserve"> and collected eye-tracking data of experimental subjects</w:t>
+      </w:r>
+      <w:r>
+        <w:rPr>
+          <w:rFonts w:asciiTheme="minorHAnsi" w:eastAsia="MS Mincho" w:hAnsiTheme="minorHAnsi" w:cstheme="minorHAnsi"/>
+          <w:b w:val="0"/>
+          <w:bCs w:val="0"/>
+          <w:sz w:val="24"/>
+          <w:szCs w:val="24"/>
+        </w:rPr>
+        <w:t>.</w:t>
+      </w:r>
+      <w:r>
+        <w:rPr>
+          <w:rFonts w:asciiTheme="minorHAnsi" w:eastAsia="MS Mincho" w:hAnsiTheme="minorHAnsi" w:cstheme="minorHAnsi"/>
+          <w:b w:val="0"/>
+          <w:bCs w:val="0"/>
+          <w:sz w:val="24"/>
+          <w:szCs w:val="24"/>
+        </w:rPr>
+        <w:t xml:space="preserve"> </w:t>
+      </w:r>
+    </w:p>
+    <w:p>
+      <w:pPr>
+        <w:pStyle w:val="JobTitlebold"/>
+        <w:ind w:left="1080"/>
+        <w:rPr>
+          <w:rFonts w:asciiTheme="minorHAnsi" w:eastAsia="MS Mincho" w:hAnsiTheme="minorHAnsi" w:cstheme="minorHAnsi"/>
+          <w:b w:val="0"/>
+          <w:bCs w:val="0"/>
+          <w:sz w:val="24"/>
+          <w:szCs w:val="24"/>
+        </w:rPr>
+      </w:pPr>
+      <w:r>
+        <w:rPr>
+          <w:rFonts w:asciiTheme="minorHAnsi" w:eastAsia="MS Mincho" w:hAnsiTheme="minorHAnsi" w:cstheme="minorHAnsi"/>
+          <w:b w:val="0"/>
+          <w:bCs w:val="0"/>
+          <w:sz w:val="24"/>
+          <w:szCs w:val="24"/>
+        </w:rPr>
+        <w:t>On further analysis, the primary factors affecting instantaneous human attention</w:t>
+      </w:r>
+      <w:r>
+        <w:rPr>
+          <w:rFonts w:asciiTheme="minorHAnsi" w:eastAsia="MS Mincho" w:hAnsiTheme="minorHAnsi" w:cstheme="minorHAnsi"/>
+          <w:b w:val="0"/>
+          <w:bCs w:val="0"/>
+          <w:sz w:val="24"/>
+          <w:szCs w:val="24"/>
+        </w:rPr>
+        <w:t xml:space="preserve"> on </w:t>
+      </w:r>
+      <w:r>
+        <w:rPr>
+          <w:rFonts w:asciiTheme="minorHAnsi" w:eastAsia="MS Mincho" w:hAnsiTheme="minorHAnsi" w:cstheme="minorHAnsi"/>
+          <w:b w:val="0"/>
+          <w:bCs w:val="0"/>
+          <w:sz w:val="24"/>
+          <w:szCs w:val="24"/>
+        </w:rPr>
+        <w:t>“</w:t>
+      </w:r>
+      <w:r>
+        <w:rPr>
+          <w:rFonts w:asciiTheme="minorHAnsi" w:eastAsia="MS Mincho" w:hAnsiTheme="minorHAnsi" w:cstheme="minorHAnsi"/>
+          <w:b w:val="0"/>
+          <w:bCs w:val="0"/>
+          <w:sz w:val="24"/>
+          <w:szCs w:val="24"/>
+        </w:rPr>
+        <w:t>web objects</w:t>
+      </w:r>
+      <w:r>
+        <w:rPr>
+          <w:rFonts w:asciiTheme="minorHAnsi" w:eastAsia="MS Mincho" w:hAnsiTheme="minorHAnsi" w:cstheme="minorHAnsi"/>
+          <w:b w:val="0"/>
+          <w:bCs w:val="0"/>
+          <w:sz w:val="24"/>
+          <w:szCs w:val="24"/>
+        </w:rPr>
+        <w:t>”</w:t>
+      </w:r>
+      <w:r>
+        <w:rPr>
+          <w:rFonts w:asciiTheme="minorHAnsi" w:eastAsia="MS Mincho" w:hAnsiTheme="minorHAnsi" w:cstheme="minorHAnsi"/>
+          <w:b w:val="0"/>
+          <w:bCs w:val="0"/>
+          <w:sz w:val="24"/>
+          <w:szCs w:val="24"/>
+        </w:rPr>
+        <w:t xml:space="preserve"> </w:t>
+      </w:r>
+      <w:r>
+        <w:rPr>
+          <w:rFonts w:asciiTheme="minorHAnsi" w:eastAsia="MS Mincho" w:hAnsiTheme="minorHAnsi" w:cstheme="minorHAnsi"/>
+          <w:b w:val="0"/>
+          <w:bCs w:val="0"/>
+          <w:sz w:val="24"/>
+          <w:szCs w:val="24"/>
+        </w:rPr>
+        <w:t>were</w:t>
+      </w:r>
+      <w:r>
+        <w:rPr>
+          <w:rFonts w:asciiTheme="minorHAnsi" w:eastAsia="MS Mincho" w:hAnsiTheme="minorHAnsi" w:cstheme="minorHAnsi"/>
+          <w:b w:val="0"/>
+          <w:bCs w:val="0"/>
+          <w:sz w:val="24"/>
+          <w:szCs w:val="24"/>
+        </w:rPr>
+        <w:t xml:space="preserve"> </w:t>
+      </w:r>
+      <w:r>
+        <w:rPr>
+          <w:rFonts w:asciiTheme="minorHAnsi" w:eastAsia="MS Mincho" w:hAnsiTheme="minorHAnsi" w:cstheme="minorHAnsi"/>
+          <w:b w:val="0"/>
+          <w:bCs w:val="0"/>
+          <w:sz w:val="24"/>
+          <w:szCs w:val="24"/>
+        </w:rPr>
+        <w:t>positively correlated with th</w:t>
+      </w:r>
+      <w:r>
+        <w:rPr>
+          <w:rFonts w:asciiTheme="minorHAnsi" w:eastAsia="MS Mincho" w:hAnsiTheme="minorHAnsi" w:cstheme="minorHAnsi"/>
+          <w:b w:val="0"/>
+          <w:bCs w:val="0"/>
+          <w:sz w:val="24"/>
+          <w:szCs w:val="24"/>
+        </w:rPr>
+        <w:t>eir</w:t>
+      </w:r>
+      <w:r>
+        <w:rPr>
+          <w:rFonts w:asciiTheme="minorHAnsi" w:eastAsia="MS Mincho" w:hAnsiTheme="minorHAnsi" w:cstheme="minorHAnsi"/>
+          <w:b w:val="0"/>
+          <w:bCs w:val="0"/>
+          <w:sz w:val="24"/>
+          <w:szCs w:val="24"/>
+        </w:rPr>
+        <w:t xml:space="preserve"> location at the top and center of screen, their size</w:t>
+      </w:r>
+      <w:r>
+        <w:rPr>
+          <w:rFonts w:asciiTheme="minorHAnsi" w:eastAsia="MS Mincho" w:hAnsiTheme="minorHAnsi" w:cstheme="minorHAnsi"/>
+          <w:b w:val="0"/>
+          <w:bCs w:val="0"/>
+          <w:sz w:val="24"/>
+          <w:szCs w:val="24"/>
+        </w:rPr>
+        <w:t>,</w:t>
+      </w:r>
+      <w:r>
+        <w:rPr>
+          <w:rFonts w:asciiTheme="minorHAnsi" w:eastAsia="MS Mincho" w:hAnsiTheme="minorHAnsi" w:cstheme="minorHAnsi"/>
+          <w:b w:val="0"/>
+          <w:bCs w:val="0"/>
+          <w:sz w:val="24"/>
+          <w:szCs w:val="24"/>
+        </w:rPr>
+        <w:t xml:space="preserve"> and </w:t>
+      </w:r>
+      <w:r>
+        <w:rPr>
+          <w:rFonts w:asciiTheme="minorHAnsi" w:eastAsia="MS Mincho" w:hAnsiTheme="minorHAnsi" w:cstheme="minorHAnsi"/>
+          <w:b w:val="0"/>
+          <w:bCs w:val="0"/>
+          <w:sz w:val="24"/>
+          <w:szCs w:val="24"/>
+        </w:rPr>
+        <w:t xml:space="preserve">their </w:t>
+      </w:r>
+      <w:r>
+        <w:rPr>
+          <w:rFonts w:asciiTheme="minorHAnsi" w:eastAsia="MS Mincho" w:hAnsiTheme="minorHAnsi" w:cstheme="minorHAnsi"/>
+          <w:b w:val="0"/>
+          <w:bCs w:val="0"/>
+          <w:sz w:val="24"/>
+          <w:szCs w:val="24"/>
+        </w:rPr>
+        <w:t>contrast</w:t>
+      </w:r>
+      <w:r>
+        <w:rPr>
+          <w:rFonts w:asciiTheme="minorHAnsi" w:eastAsia="MS Mincho" w:hAnsiTheme="minorHAnsi" w:cstheme="minorHAnsi"/>
+          <w:b w:val="0"/>
+          <w:bCs w:val="0"/>
+          <w:sz w:val="24"/>
+          <w:szCs w:val="24"/>
+        </w:rPr>
+        <w:t>.</w:t>
+      </w:r>
+      <w:r>
+        <w:rPr>
+          <w:rFonts w:asciiTheme="minorHAnsi" w:eastAsia="MS Mincho" w:hAnsiTheme="minorHAnsi" w:cstheme="minorHAnsi"/>
+          <w:b w:val="0"/>
+          <w:bCs w:val="0"/>
+          <w:sz w:val="24"/>
+          <w:szCs w:val="24"/>
+        </w:rPr>
+        <w:t xml:space="preserve"> </w:t>
+      </w:r>
+      <w:r>
+        <w:rPr>
+          <w:rFonts w:asciiTheme="minorHAnsi" w:eastAsia="MS Mincho" w:hAnsiTheme="minorHAnsi" w:cstheme="minorHAnsi"/>
+          <w:b w:val="0"/>
+          <w:bCs w:val="0"/>
+          <w:sz w:val="24"/>
+          <w:szCs w:val="24"/>
+        </w:rPr>
+        <w:t>However,</w:t>
+      </w:r>
+      <w:r>
+        <w:rPr>
+          <w:rFonts w:asciiTheme="minorHAnsi" w:eastAsia="MS Mincho" w:hAnsiTheme="minorHAnsi" w:cstheme="minorHAnsi"/>
+          <w:b w:val="0"/>
+          <w:bCs w:val="0"/>
+          <w:sz w:val="24"/>
+          <w:szCs w:val="24"/>
+        </w:rPr>
+        <w:t xml:space="preserve"> </w:t>
+      </w:r>
+      <w:r>
+        <w:rPr>
+          <w:rFonts w:asciiTheme="minorHAnsi" w:eastAsia="MS Mincho" w:hAnsiTheme="minorHAnsi" w:cstheme="minorHAnsi"/>
+          <w:b w:val="0"/>
+          <w:bCs w:val="0"/>
+          <w:sz w:val="24"/>
+          <w:szCs w:val="24"/>
+        </w:rPr>
+        <w:t xml:space="preserve">an </w:t>
+      </w:r>
+      <w:r>
+        <w:rPr>
+          <w:rFonts w:asciiTheme="minorHAnsi" w:eastAsia="MS Mincho" w:hAnsiTheme="minorHAnsi" w:cstheme="minorHAnsi"/>
+          <w:b w:val="0"/>
+          <w:bCs w:val="0"/>
+          <w:sz w:val="24"/>
+          <w:szCs w:val="24"/>
+        </w:rPr>
+        <w:t xml:space="preserve">increase </w:t>
+      </w:r>
+      <w:r>
+        <w:rPr>
+          <w:rFonts w:asciiTheme="minorHAnsi" w:eastAsia="MS Mincho" w:hAnsiTheme="minorHAnsi" w:cstheme="minorHAnsi"/>
+          <w:b w:val="0"/>
+          <w:bCs w:val="0"/>
+          <w:sz w:val="24"/>
+          <w:szCs w:val="24"/>
+        </w:rPr>
+        <w:t>in</w:t>
+      </w:r>
+      <w:r>
+        <w:rPr>
+          <w:rFonts w:asciiTheme="minorHAnsi" w:eastAsia="MS Mincho" w:hAnsiTheme="minorHAnsi" w:cstheme="minorHAnsi"/>
+          <w:b w:val="0"/>
+          <w:bCs w:val="0"/>
+          <w:sz w:val="24"/>
+          <w:szCs w:val="24"/>
+        </w:rPr>
+        <w:t xml:space="preserve"> t</w:t>
+      </w:r>
+      <w:r>
+        <w:rPr>
+          <w:rFonts w:asciiTheme="minorHAnsi" w:eastAsia="MS Mincho" w:hAnsiTheme="minorHAnsi" w:cstheme="minorHAnsi"/>
+          <w:b w:val="0"/>
+          <w:bCs w:val="0"/>
+          <w:sz w:val="24"/>
+          <w:szCs w:val="24"/>
+        </w:rPr>
+        <w:t>heir mean grey value</w:t>
+      </w:r>
+      <w:r>
+        <w:rPr>
+          <w:rFonts w:asciiTheme="minorHAnsi" w:eastAsia="MS Mincho" w:hAnsiTheme="minorHAnsi" w:cstheme="minorHAnsi"/>
+          <w:b w:val="0"/>
+          <w:bCs w:val="0"/>
+          <w:sz w:val="24"/>
+          <w:szCs w:val="24"/>
+        </w:rPr>
+        <w:t xml:space="preserve"> tends to</w:t>
+      </w:r>
+      <w:r>
+        <w:rPr>
+          <w:rFonts w:asciiTheme="minorHAnsi" w:eastAsia="MS Mincho" w:hAnsiTheme="minorHAnsi" w:cstheme="minorHAnsi"/>
+          <w:b w:val="0"/>
+          <w:bCs w:val="0"/>
+          <w:sz w:val="24"/>
+          <w:szCs w:val="24"/>
+        </w:rPr>
+        <w:t xml:space="preserve"> negatively </w:t>
+      </w:r>
+      <w:r>
+        <w:rPr>
+          <w:rFonts w:asciiTheme="minorHAnsi" w:eastAsia="MS Mincho" w:hAnsiTheme="minorHAnsi" w:cstheme="minorHAnsi"/>
+          <w:b w:val="0"/>
+          <w:bCs w:val="0"/>
+          <w:sz w:val="24"/>
+          <w:szCs w:val="24"/>
+        </w:rPr>
+        <w:t>affect</w:t>
+      </w:r>
+      <w:r>
+        <w:rPr>
+          <w:rFonts w:asciiTheme="minorHAnsi" w:eastAsia="MS Mincho" w:hAnsiTheme="minorHAnsi" w:cstheme="minorHAnsi"/>
+          <w:b w:val="0"/>
+          <w:bCs w:val="0"/>
+          <w:sz w:val="24"/>
+          <w:szCs w:val="24"/>
+        </w:rPr>
+        <w:t xml:space="preserve"> </w:t>
+      </w:r>
+      <w:r>
+        <w:rPr>
+          <w:rFonts w:asciiTheme="minorHAnsi" w:eastAsia="MS Mincho" w:hAnsiTheme="minorHAnsi" w:cstheme="minorHAnsi"/>
+          <w:b w:val="0"/>
+          <w:bCs w:val="0"/>
+          <w:sz w:val="24"/>
+          <w:szCs w:val="24"/>
+        </w:rPr>
+        <w:t xml:space="preserve">human </w:t>
+      </w:r>
+      <w:r>
+        <w:rPr>
+          <w:rFonts w:asciiTheme="minorHAnsi" w:eastAsia="MS Mincho" w:hAnsiTheme="minorHAnsi" w:cstheme="minorHAnsi"/>
+          <w:b w:val="0"/>
+          <w:bCs w:val="0"/>
+          <w:sz w:val="24"/>
+          <w:szCs w:val="24"/>
+        </w:rPr>
+        <w:t xml:space="preserve">attentiveness.  </w:t>
+      </w:r>
+    </w:p>
+    <w:p>
+      <w:pPr>
+        <w:pStyle w:val="JobTitlebold"/>
+        <w:ind w:left="1080"/>
+        <w:rPr>
+          <w:rFonts w:asciiTheme="minorHAnsi" w:eastAsia="MS Mincho" w:hAnsiTheme="minorHAnsi" w:cstheme="minorHAnsi"/>
+          <w:b w:val="0"/>
+          <w:bCs w:val="0"/>
+          <w:sz w:val="24"/>
+          <w:szCs w:val="24"/>
+        </w:rPr>
+      </w:pPr>
+      <w:r>
+        <w:rPr>
+          <w:rFonts w:asciiTheme="minorHAnsi" w:eastAsia="MS Mincho" w:hAnsiTheme="minorHAnsi" w:cstheme="minorHAnsi"/>
+          <w:b w:val="0"/>
+          <w:bCs w:val="0"/>
+          <w:sz w:val="24"/>
+          <w:szCs w:val="24"/>
+        </w:rPr>
+        <w:t xml:space="preserve">Although tilted </w:t>
+      </w:r>
+      <w:r>
+        <w:rPr>
+          <w:rFonts w:asciiTheme="minorHAnsi" w:eastAsia="MS Mincho" w:hAnsiTheme="minorHAnsi" w:cstheme="minorHAnsi"/>
+          <w:b w:val="0"/>
+          <w:bCs w:val="0"/>
+          <w:sz w:val="24"/>
+          <w:szCs w:val="24"/>
+        </w:rPr>
+        <w:t xml:space="preserve">more </w:t>
+      </w:r>
+      <w:r>
+        <w:rPr>
+          <w:rFonts w:asciiTheme="minorHAnsi" w:eastAsia="MS Mincho" w:hAnsiTheme="minorHAnsi" w:cstheme="minorHAnsi"/>
+          <w:b w:val="0"/>
+          <w:bCs w:val="0"/>
+          <w:sz w:val="24"/>
+          <w:szCs w:val="24"/>
+        </w:rPr>
+        <w:t>towards mathematical rigor</w:t>
+      </w:r>
+      <w:r>
+        <w:rPr>
+          <w:rFonts w:asciiTheme="minorHAnsi" w:eastAsia="MS Mincho" w:hAnsiTheme="minorHAnsi" w:cstheme="minorHAnsi"/>
+          <w:b w:val="0"/>
+          <w:bCs w:val="0"/>
+          <w:sz w:val="24"/>
+          <w:szCs w:val="24"/>
+        </w:rPr>
+        <w:t xml:space="preserve">, </w:t>
+      </w:r>
+      <w:r>
+        <w:rPr>
+          <w:rFonts w:asciiTheme="minorHAnsi" w:eastAsia="MS Mincho" w:hAnsiTheme="minorHAnsi" w:cstheme="minorHAnsi"/>
+          <w:b w:val="0"/>
+          <w:bCs w:val="0"/>
+          <w:sz w:val="24"/>
+          <w:szCs w:val="24"/>
+        </w:rPr>
+        <w:t xml:space="preserve">the </w:t>
+      </w:r>
+      <w:r>
+        <w:rPr>
+          <w:rFonts w:asciiTheme="minorHAnsi" w:eastAsia="MS Mincho" w:hAnsiTheme="minorHAnsi" w:cstheme="minorHAnsi"/>
+          <w:b w:val="0"/>
+          <w:bCs w:val="0"/>
+          <w:sz w:val="24"/>
+          <w:szCs w:val="24"/>
+        </w:rPr>
+        <w:t>dis</w:t>
+      </w:r>
+      <w:r>
+        <w:rPr>
+          <w:rFonts w:asciiTheme="minorHAnsi" w:eastAsia="MS Mincho" w:hAnsiTheme="minorHAnsi" w:cstheme="minorHAnsi"/>
+          <w:b w:val="0"/>
+          <w:bCs w:val="0"/>
+          <w:sz w:val="24"/>
+          <w:szCs w:val="24"/>
+        </w:rPr>
+        <w:t>quis</w:t>
+      </w:r>
+      <w:r>
+        <w:rPr>
+          <w:rFonts w:asciiTheme="minorHAnsi" w:eastAsia="MS Mincho" w:hAnsiTheme="minorHAnsi" w:cstheme="minorHAnsi"/>
+          <w:b w:val="0"/>
+          <w:bCs w:val="0"/>
+          <w:sz w:val="24"/>
+          <w:szCs w:val="24"/>
+        </w:rPr>
+        <w:t>i</w:t>
+      </w:r>
+      <w:r>
+        <w:rPr>
+          <w:rFonts w:asciiTheme="minorHAnsi" w:eastAsia="MS Mincho" w:hAnsiTheme="minorHAnsi" w:cstheme="minorHAnsi"/>
+          <w:b w:val="0"/>
+          <w:bCs w:val="0"/>
+          <w:sz w:val="24"/>
+          <w:szCs w:val="24"/>
+        </w:rPr>
+        <w:t>tion</w:t>
+      </w:r>
+      <w:r>
+        <w:rPr>
+          <w:rFonts w:asciiTheme="minorHAnsi" w:eastAsia="MS Mincho" w:hAnsiTheme="minorHAnsi" w:cstheme="minorHAnsi"/>
+          <w:b w:val="0"/>
+          <w:bCs w:val="0"/>
+          <w:sz w:val="24"/>
+          <w:szCs w:val="24"/>
+        </w:rPr>
+        <w:t>,</w:t>
+      </w:r>
+      <w:r>
+        <w:rPr>
+          <w:rFonts w:asciiTheme="minorHAnsi" w:eastAsia="MS Mincho" w:hAnsiTheme="minorHAnsi" w:cstheme="minorHAnsi"/>
+          <w:b w:val="0"/>
+          <w:bCs w:val="0"/>
+          <w:sz w:val="24"/>
+          <w:szCs w:val="24"/>
+        </w:rPr>
+        <w:t xml:space="preserve"> left permanent impression on my </w:t>
+      </w:r>
+      <w:r>
+        <w:rPr>
+          <w:rFonts w:asciiTheme="minorHAnsi" w:eastAsia="MS Mincho" w:hAnsiTheme="minorHAnsi" w:cstheme="minorHAnsi"/>
+          <w:b w:val="0"/>
+          <w:bCs w:val="0"/>
+          <w:sz w:val="24"/>
+          <w:szCs w:val="24"/>
+        </w:rPr>
+        <w:t xml:space="preserve">subsequent </w:t>
+      </w:r>
+      <w:bookmarkStart w:id="0" w:name="_GoBack"/>
+      <w:bookmarkEnd w:id="0"/>
+      <w:r>
+        <w:rPr>
+          <w:rFonts w:asciiTheme="minorHAnsi" w:eastAsia="MS Mincho" w:hAnsiTheme="minorHAnsi" w:cstheme="minorHAnsi"/>
+          <w:b w:val="0"/>
+          <w:bCs w:val="0"/>
+          <w:sz w:val="24"/>
+          <w:szCs w:val="24"/>
+        </w:rPr>
+        <w:t xml:space="preserve">career </w:t>
+      </w:r>
+      <w:r>
+        <w:rPr>
+          <w:rFonts w:asciiTheme="minorHAnsi" w:eastAsia="MS Mincho" w:hAnsiTheme="minorHAnsi" w:cstheme="minorHAnsi"/>
+          <w:b w:val="0"/>
+          <w:bCs w:val="0"/>
+          <w:sz w:val="24"/>
+          <w:szCs w:val="24"/>
+        </w:rPr>
+        <w:t>expression</w:t>
+      </w:r>
+      <w:r>
+        <w:rPr>
+          <w:rFonts w:asciiTheme="minorHAnsi" w:eastAsia="MS Mincho" w:hAnsiTheme="minorHAnsi" w:cstheme="minorHAnsi"/>
+          <w:b w:val="0"/>
+          <w:bCs w:val="0"/>
+          <w:sz w:val="24"/>
+          <w:szCs w:val="24"/>
+        </w:rPr>
+        <w:t xml:space="preserve">. </w:t>
+      </w:r>
     </w:p>
     <w:p>
       <w:pPr>
@@ -1595,118 +2280,6 @@
           <w:t>https://github.com/prateekrastogi/Evolution-of-R</w:t>
         </w:r>
       </w:hyperlink>
-    </w:p>
-    <w:p>
-      <w:pPr>
-        <w:pStyle w:val="JobTitlebold"/>
-        <w:tabs>
-          <w:tab w:val="right" w:pos="720"/>
-        </w:tabs>
-        <w:ind w:left="1080"/>
-        <w:rPr>
-          <w:rFonts w:asciiTheme="majorHAnsi" w:eastAsia="MS Mincho" w:hAnsiTheme="majorHAnsi"/>
-          <w:sz w:val="24"/>
-          <w:szCs w:val="24"/>
-        </w:rPr>
-      </w:pPr>
-    </w:p>
-    <w:p>
-      <w:pPr>
-        <w:pStyle w:val="JobTitlebold"/>
-        <w:tabs>
-          <w:tab w:val="right" w:pos="720"/>
-        </w:tabs>
-        <w:ind w:left="1080"/>
-        <w:rPr>
-          <w:rFonts w:asciiTheme="majorHAnsi" w:eastAsia="MS Mincho" w:hAnsiTheme="majorHAnsi"/>
-          <w:sz w:val="24"/>
-          <w:szCs w:val="24"/>
-        </w:rPr>
-      </w:pPr>
-    </w:p>
-    <w:p>
-      <w:pPr>
-        <w:pStyle w:val="JobTitlebold"/>
-        <w:tabs>
-          <w:tab w:val="right" w:pos="720"/>
-        </w:tabs>
-        <w:ind w:left="1080"/>
-        <w:rPr>
-          <w:rFonts w:asciiTheme="majorHAnsi" w:eastAsia="MS Mincho" w:hAnsiTheme="majorHAnsi"/>
-          <w:sz w:val="24"/>
-          <w:szCs w:val="24"/>
-        </w:rPr>
-      </w:pPr>
-    </w:p>
-    <w:p>
-      <w:pPr>
-        <w:pStyle w:val="JobTitlebold"/>
-        <w:tabs>
-          <w:tab w:val="right" w:pos="720"/>
-        </w:tabs>
-        <w:ind w:left="1080"/>
-        <w:rPr>
-          <w:rFonts w:asciiTheme="majorHAnsi" w:eastAsia="MS Mincho" w:hAnsiTheme="majorHAnsi"/>
-          <w:sz w:val="24"/>
-          <w:szCs w:val="24"/>
-        </w:rPr>
-      </w:pPr>
-    </w:p>
-    <w:p>
-      <w:pPr>
-        <w:pStyle w:val="JobTitlebold"/>
-        <w:tabs>
-          <w:tab w:val="right" w:pos="720"/>
-        </w:tabs>
-        <w:ind w:left="1080"/>
-        <w:rPr>
-          <w:rFonts w:asciiTheme="majorHAnsi" w:eastAsia="MS Mincho" w:hAnsiTheme="majorHAnsi"/>
-          <w:sz w:val="24"/>
-          <w:szCs w:val="24"/>
-        </w:rPr>
-      </w:pPr>
-    </w:p>
-    <w:p>
-      <w:pPr>
-        <w:pStyle w:val="JobTitlebold"/>
-        <w:tabs>
-          <w:tab w:val="right" w:pos="720"/>
-        </w:tabs>
-        <w:ind w:left="1080"/>
-        <w:rPr>
-          <w:rFonts w:asciiTheme="majorHAnsi" w:eastAsia="MS Mincho" w:hAnsiTheme="majorHAnsi"/>
-          <w:sz w:val="24"/>
-          <w:szCs w:val="24"/>
-        </w:rPr>
-      </w:pPr>
-    </w:p>
-    <w:p>
-      <w:pPr>
-        <w:pStyle w:val="JobTitlebold"/>
-        <w:tabs>
-          <w:tab w:val="right" w:pos="720"/>
-        </w:tabs>
-        <w:ind w:left="1080"/>
-        <w:rPr>
-          <w:rFonts w:asciiTheme="majorHAnsi" w:eastAsia="MS Mincho" w:hAnsiTheme="majorHAnsi"/>
-          <w:sz w:val="24"/>
-          <w:szCs w:val="24"/>
-        </w:rPr>
-      </w:pPr>
-    </w:p>
-    <w:p>
-      <w:pPr>
-        <w:pStyle w:val="JobTitlebold"/>
-        <w:tabs>
-          <w:tab w:val="right" w:pos="720"/>
-        </w:tabs>
-        <w:ind w:left="0"/>
-        <w:rPr>
-          <w:rFonts w:eastAsia="MS Mincho"/>
-          <w:sz w:val="24"/>
-          <w:szCs w:val="24"/>
-        </w:rPr>
-      </w:pPr>
     </w:p>
     <w:p>
       <w:pPr>
@@ -2230,9 +2803,8 @@
           <w:sz w:val="24"/>
           <w:szCs w:val="24"/>
         </w:rPr>
-        <w:t xml:space="preserve"> such as Gatsby, </w:t>
-      </w:r>
-      <w:proofErr w:type="spellStart"/>
+        <w:t xml:space="preserve"> such as Gatsby, LoopBack, and Universal Recommender</w:t>
+      </w:r>
       <w:r>
         <w:rPr>
           <w:rFonts w:eastAsia="MS Mincho"/>
@@ -2240,9 +2812,8 @@
           <w:sz w:val="24"/>
           <w:szCs w:val="24"/>
         </w:rPr>
-        <w:t>LoopBack</w:t>
-      </w:r>
-      <w:proofErr w:type="spellEnd"/>
+        <w:t>,</w:t>
+      </w:r>
       <w:r>
         <w:rPr>
           <w:rFonts w:eastAsia="MS Mincho"/>
@@ -2250,7 +2821,7 @@
           <w:sz w:val="24"/>
           <w:szCs w:val="24"/>
         </w:rPr>
-        <w:t>, and Universal Recommender</w:t>
+        <w:t xml:space="preserve"> and</w:t>
       </w:r>
       <w:r>
         <w:rPr>
@@ -2259,6 +2830,186 @@
           <w:sz w:val="24"/>
           <w:szCs w:val="24"/>
         </w:rPr>
+        <w:t xml:space="preserve"> via</w:t>
+      </w:r>
+      <w:r>
+        <w:rPr>
+          <w:rFonts w:eastAsia="MS Mincho"/>
+          <w:b w:val="0"/>
+          <w:sz w:val="24"/>
+          <w:szCs w:val="24"/>
+        </w:rPr>
+        <w:t xml:space="preserve"> </w:t>
+      </w:r>
+      <w:r>
+        <w:rPr>
+          <w:rFonts w:eastAsia="MS Mincho"/>
+          <w:b w:val="0"/>
+          <w:sz w:val="24"/>
+          <w:szCs w:val="24"/>
+        </w:rPr>
+        <w:t>arbitrage</w:t>
+      </w:r>
+      <w:r>
+        <w:rPr>
+          <w:rFonts w:eastAsia="MS Mincho"/>
+          <w:b w:val="0"/>
+          <w:sz w:val="24"/>
+          <w:szCs w:val="24"/>
+        </w:rPr>
+        <w:t xml:space="preserve"> </w:t>
+      </w:r>
+      <w:r>
+        <w:rPr>
+          <w:rFonts w:eastAsia="MS Mincho"/>
+          <w:b w:val="0"/>
+          <w:sz w:val="24"/>
+          <w:szCs w:val="24"/>
+        </w:rPr>
+        <w:t xml:space="preserve">value </w:t>
+      </w:r>
+      <w:r>
+        <w:rPr>
+          <w:rFonts w:eastAsia="MS Mincho"/>
+          <w:b w:val="0"/>
+          <w:sz w:val="24"/>
+          <w:szCs w:val="24"/>
+        </w:rPr>
+        <w:t>injection</w:t>
+      </w:r>
+      <w:r>
+        <w:rPr>
+          <w:rFonts w:eastAsia="MS Mincho"/>
+          <w:b w:val="0"/>
+          <w:sz w:val="24"/>
+          <w:szCs w:val="24"/>
+        </w:rPr>
+        <w:t>s</w:t>
+      </w:r>
+      <w:r>
+        <w:rPr>
+          <w:rFonts w:eastAsia="MS Mincho"/>
+          <w:b w:val="0"/>
+          <w:sz w:val="24"/>
+          <w:szCs w:val="24"/>
+        </w:rPr>
+        <w:t xml:space="preserve"> </w:t>
+      </w:r>
+      <w:r>
+        <w:rPr>
+          <w:rFonts w:eastAsia="MS Mincho"/>
+          <w:b w:val="0"/>
+          <w:sz w:val="24"/>
+          <w:szCs w:val="24"/>
+        </w:rPr>
+        <w:t>in existing system</w:t>
+      </w:r>
+      <w:r>
+        <w:rPr>
+          <w:rFonts w:eastAsia="MS Mincho"/>
+          <w:b w:val="0"/>
+          <w:sz w:val="24"/>
+          <w:szCs w:val="24"/>
+        </w:rPr>
+        <w:t>s</w:t>
+      </w:r>
+      <w:r>
+        <w:rPr>
+          <w:rFonts w:eastAsia="MS Mincho"/>
+          <w:b w:val="0"/>
+          <w:sz w:val="24"/>
+          <w:szCs w:val="24"/>
+        </w:rPr>
+        <w:t xml:space="preserve"> </w:t>
+      </w:r>
+      <w:r>
+        <w:rPr>
+          <w:rFonts w:eastAsia="MS Mincho"/>
+          <w:b w:val="0"/>
+          <w:sz w:val="24"/>
+          <w:szCs w:val="24"/>
+        </w:rPr>
+        <w:t>with</w:t>
+      </w:r>
+      <w:r>
+        <w:rPr>
+          <w:rFonts w:eastAsia="MS Mincho"/>
+          <w:b w:val="0"/>
+          <w:sz w:val="24"/>
+          <w:szCs w:val="24"/>
+        </w:rPr>
+        <w:t xml:space="preserve"> </w:t>
+      </w:r>
+      <w:r>
+        <w:rPr>
+          <w:rFonts w:eastAsia="MS Mincho"/>
+          <w:b w:val="0"/>
+          <w:sz w:val="24"/>
+          <w:szCs w:val="24"/>
+        </w:rPr>
+        <w:t xml:space="preserve">PWAs, </w:t>
+      </w:r>
+      <w:r>
+        <w:rPr>
+          <w:rFonts w:eastAsia="MS Mincho"/>
+          <w:b w:val="0"/>
+          <w:sz w:val="24"/>
+          <w:szCs w:val="24"/>
+        </w:rPr>
+        <w:t>S</w:t>
+      </w:r>
+      <w:r>
+        <w:rPr>
+          <w:rFonts w:eastAsia="MS Mincho"/>
+          <w:b w:val="0"/>
+          <w:sz w:val="24"/>
+          <w:szCs w:val="24"/>
+        </w:rPr>
+        <w:t xml:space="preserve">treamable </w:t>
+      </w:r>
+      <w:r>
+        <w:rPr>
+          <w:rFonts w:eastAsia="MS Mincho"/>
+          <w:b w:val="0"/>
+          <w:sz w:val="24"/>
+          <w:szCs w:val="24"/>
+        </w:rPr>
+        <w:t>W</w:t>
+      </w:r>
+      <w:r>
+        <w:rPr>
+          <w:rFonts w:eastAsia="MS Mincho"/>
+          <w:b w:val="0"/>
+          <w:sz w:val="24"/>
+          <w:szCs w:val="24"/>
+        </w:rPr>
+        <w:t xml:space="preserve">eb </w:t>
+      </w:r>
+      <w:r>
+        <w:rPr>
+          <w:rFonts w:eastAsia="MS Mincho"/>
+          <w:b w:val="0"/>
+          <w:sz w:val="24"/>
+          <w:szCs w:val="24"/>
+        </w:rPr>
+        <w:t>A</w:t>
+      </w:r>
+      <w:r>
+        <w:rPr>
+          <w:rFonts w:eastAsia="MS Mincho"/>
+          <w:b w:val="0"/>
+          <w:sz w:val="24"/>
+          <w:szCs w:val="24"/>
+        </w:rPr>
+        <w:t>pps</w:t>
+      </w:r>
+      <w:r>
+        <w:rPr>
+          <w:rFonts w:eastAsia="MS Mincho"/>
+          <w:b w:val="0"/>
+          <w:sz w:val="24"/>
+          <w:szCs w:val="24"/>
+        </w:rPr>
         <w:t>,</w:t>
       </w:r>
       <w:r>
@@ -2268,7 +3019,7 @@
           <w:sz w:val="24"/>
           <w:szCs w:val="24"/>
         </w:rPr>
-        <w:t xml:space="preserve"> and</w:t>
+        <w:t xml:space="preserve"> </w:t>
       </w:r>
       <w:r>
         <w:rPr>
@@ -2277,7 +3028,7 @@
           <w:sz w:val="24"/>
           <w:szCs w:val="24"/>
         </w:rPr>
-        <w:t xml:space="preserve"> via</w:t>
+        <w:br/>
       </w:r>
       <w:r>
         <w:rPr>
@@ -2286,7 +3037,7 @@
           <w:sz w:val="24"/>
           <w:szCs w:val="24"/>
         </w:rPr>
-        <w:t xml:space="preserve"> </w:t>
+        <w:t>Gr</w:t>
       </w:r>
       <w:r>
         <w:rPr>
@@ -2295,7 +3046,7 @@
           <w:sz w:val="24"/>
           <w:szCs w:val="24"/>
         </w:rPr>
-        <w:t>arbitrage</w:t>
+        <w:t>a</w:t>
       </w:r>
       <w:r>
         <w:rPr>
@@ -2304,227 +3055,7 @@
           <w:sz w:val="24"/>
           <w:szCs w:val="24"/>
         </w:rPr>
-        <w:t xml:space="preserve"> </w:t>
-      </w:r>
-      <w:r>
-        <w:rPr>
-          <w:rFonts w:eastAsia="MS Mincho"/>
-          <w:b w:val="0"/>
-          <w:sz w:val="24"/>
-          <w:szCs w:val="24"/>
-        </w:rPr>
-        <w:t xml:space="preserve">value </w:t>
-      </w:r>
-      <w:r>
-        <w:rPr>
-          <w:rFonts w:eastAsia="MS Mincho"/>
-          <w:b w:val="0"/>
-          <w:sz w:val="24"/>
-          <w:szCs w:val="24"/>
-        </w:rPr>
-        <w:t>injection</w:t>
-      </w:r>
-      <w:r>
-        <w:rPr>
-          <w:rFonts w:eastAsia="MS Mincho"/>
-          <w:b w:val="0"/>
-          <w:sz w:val="24"/>
-          <w:szCs w:val="24"/>
-        </w:rPr>
-        <w:t>s</w:t>
-      </w:r>
-      <w:r>
-        <w:rPr>
-          <w:rFonts w:eastAsia="MS Mincho"/>
-          <w:b w:val="0"/>
-          <w:sz w:val="24"/>
-          <w:szCs w:val="24"/>
-        </w:rPr>
-        <w:t xml:space="preserve"> </w:t>
-      </w:r>
-      <w:r>
-        <w:rPr>
-          <w:rFonts w:eastAsia="MS Mincho"/>
-          <w:b w:val="0"/>
-          <w:sz w:val="24"/>
-          <w:szCs w:val="24"/>
-        </w:rPr>
-        <w:t>in existing system</w:t>
-      </w:r>
-      <w:r>
-        <w:rPr>
-          <w:rFonts w:eastAsia="MS Mincho"/>
-          <w:b w:val="0"/>
-          <w:sz w:val="24"/>
-          <w:szCs w:val="24"/>
-        </w:rPr>
-        <w:t>s</w:t>
-      </w:r>
-      <w:r>
-        <w:rPr>
-          <w:rFonts w:eastAsia="MS Mincho"/>
-          <w:b w:val="0"/>
-          <w:sz w:val="24"/>
-          <w:szCs w:val="24"/>
-        </w:rPr>
-        <w:t xml:space="preserve"> </w:t>
-      </w:r>
-      <w:r>
-        <w:rPr>
-          <w:rFonts w:eastAsia="MS Mincho"/>
-          <w:b w:val="0"/>
-          <w:sz w:val="24"/>
-          <w:szCs w:val="24"/>
-        </w:rPr>
-        <w:t>with</w:t>
-      </w:r>
-      <w:r>
-        <w:rPr>
-          <w:rFonts w:eastAsia="MS Mincho"/>
-          <w:b w:val="0"/>
-          <w:sz w:val="24"/>
-          <w:szCs w:val="24"/>
-        </w:rPr>
-        <w:t xml:space="preserve"> </w:t>
-      </w:r>
-      <w:r>
-        <w:rPr>
-          <w:rFonts w:eastAsia="MS Mincho"/>
-          <w:b w:val="0"/>
-          <w:sz w:val="24"/>
-          <w:szCs w:val="24"/>
-        </w:rPr>
-        <w:t xml:space="preserve">PWAs, </w:t>
-      </w:r>
-      <w:proofErr w:type="spellStart"/>
-      <w:r>
-        <w:rPr>
-          <w:rFonts w:eastAsia="MS Mincho"/>
-          <w:b w:val="0"/>
-          <w:sz w:val="24"/>
-          <w:szCs w:val="24"/>
-        </w:rPr>
-        <w:t>S</w:t>
-      </w:r>
-      <w:r>
-        <w:rPr>
-          <w:rFonts w:eastAsia="MS Mincho"/>
-          <w:b w:val="0"/>
-          <w:sz w:val="24"/>
-          <w:szCs w:val="24"/>
-        </w:rPr>
-        <w:t>treamable</w:t>
-      </w:r>
-      <w:proofErr w:type="spellEnd"/>
-      <w:r>
-        <w:rPr>
-          <w:rFonts w:eastAsia="MS Mincho"/>
-          <w:b w:val="0"/>
-          <w:sz w:val="24"/>
-          <w:szCs w:val="24"/>
-        </w:rPr>
-        <w:t xml:space="preserve"> </w:t>
-      </w:r>
-      <w:r>
-        <w:rPr>
-          <w:rFonts w:eastAsia="MS Mincho"/>
-          <w:b w:val="0"/>
-          <w:sz w:val="24"/>
-          <w:szCs w:val="24"/>
-        </w:rPr>
-        <w:t>W</w:t>
-      </w:r>
-      <w:r>
-        <w:rPr>
-          <w:rFonts w:eastAsia="MS Mincho"/>
-          <w:b w:val="0"/>
-          <w:sz w:val="24"/>
-          <w:szCs w:val="24"/>
-        </w:rPr>
-        <w:t xml:space="preserve">eb </w:t>
-      </w:r>
-      <w:r>
-        <w:rPr>
-          <w:rFonts w:eastAsia="MS Mincho"/>
-          <w:b w:val="0"/>
-          <w:sz w:val="24"/>
-          <w:szCs w:val="24"/>
-        </w:rPr>
-        <w:t>A</w:t>
-      </w:r>
-      <w:r>
-        <w:rPr>
-          <w:rFonts w:eastAsia="MS Mincho"/>
-          <w:b w:val="0"/>
-          <w:sz w:val="24"/>
-          <w:szCs w:val="24"/>
-        </w:rPr>
-        <w:t>pps</w:t>
-      </w:r>
-      <w:r>
-        <w:rPr>
-          <w:rFonts w:eastAsia="MS Mincho"/>
-          <w:b w:val="0"/>
-          <w:sz w:val="24"/>
-          <w:szCs w:val="24"/>
-        </w:rPr>
-        <w:t>,</w:t>
-      </w:r>
-      <w:r>
-        <w:rPr>
-          <w:rFonts w:eastAsia="MS Mincho"/>
-          <w:b w:val="0"/>
-          <w:sz w:val="24"/>
-          <w:szCs w:val="24"/>
-        </w:rPr>
-        <w:t xml:space="preserve"> </w:t>
-      </w:r>
-      <w:r>
-        <w:rPr>
-          <w:rFonts w:eastAsia="MS Mincho"/>
-          <w:b w:val="0"/>
-          <w:sz w:val="24"/>
-          <w:szCs w:val="24"/>
-        </w:rPr>
-        <w:br/>
-      </w:r>
-      <w:proofErr w:type="spellStart"/>
-      <w:r>
-        <w:rPr>
-          <w:rFonts w:eastAsia="MS Mincho"/>
-          <w:b w:val="0"/>
-          <w:sz w:val="24"/>
-          <w:szCs w:val="24"/>
-        </w:rPr>
-        <w:t>Gr</w:t>
-      </w:r>
-      <w:r>
-        <w:rPr>
-          <w:rFonts w:eastAsia="MS Mincho"/>
-          <w:b w:val="0"/>
-          <w:sz w:val="24"/>
-          <w:szCs w:val="24"/>
-        </w:rPr>
-        <w:t>a</w:t>
-      </w:r>
-      <w:r>
-        <w:rPr>
-          <w:rFonts w:eastAsia="MS Mincho"/>
-          <w:b w:val="0"/>
-          <w:sz w:val="24"/>
-          <w:szCs w:val="24"/>
-        </w:rPr>
-        <w:t>phQL</w:t>
-      </w:r>
-      <w:proofErr w:type="spellEnd"/>
-      <w:r>
-        <w:rPr>
-          <w:rFonts w:eastAsia="MS Mincho"/>
-          <w:b w:val="0"/>
-          <w:sz w:val="24"/>
-          <w:szCs w:val="24"/>
-        </w:rPr>
-        <w:t xml:space="preserve"> API Gateway,</w:t>
+        <w:t>phQL API Gateway,</w:t>
       </w:r>
       <w:r>
         <w:rPr>
@@ -2699,8 +3230,6 @@
           <w:szCs w:val="24"/>
         </w:rPr>
       </w:pPr>
-      <w:bookmarkStart w:id="0" w:name="_GoBack"/>
-      <w:bookmarkEnd w:id="0"/>
     </w:p>
     <w:p>
       <w:pPr>
@@ -2715,7 +3244,6 @@
           <w:szCs w:val="24"/>
         </w:rPr>
       </w:pPr>
-      <w:proofErr w:type="spellStart"/>
       <w:r>
         <w:rPr>
           <w:rFonts w:asciiTheme="majorHAnsi" w:eastAsia="MS Mincho" w:hAnsiTheme="majorHAnsi"/>
@@ -2732,7 +3260,6 @@
         </w:rPr>
         <w:t>onsert</w:t>
       </w:r>
-      <w:proofErr w:type="spellEnd"/>
       <w:r>
         <w:rPr>
           <w:rFonts w:asciiTheme="majorHAnsi" w:eastAsia="MS Mincho" w:hAnsiTheme="majorHAnsi"/>
@@ -3108,7 +3635,6 @@
         </w:rPr>
         <w:t xml:space="preserve">pollo, </w:t>
       </w:r>
-      <w:proofErr w:type="spellStart"/>
       <w:r>
         <w:rPr>
           <w:rFonts w:asciiTheme="minorHAnsi" w:eastAsia="MS Mincho" w:hAnsiTheme="minorHAnsi" w:cstheme="minorHAnsi"/>
@@ -3143,9 +3669,35 @@
           <w:sz w:val="24"/>
           <w:szCs w:val="24"/>
         </w:rPr>
-        <w:t>ack</w:t>
-      </w:r>
-      <w:proofErr w:type="spellEnd"/>
+        <w:t xml:space="preserve">ack, </w:t>
+      </w:r>
+      <w:r>
+        <w:rPr>
+          <w:rFonts w:asciiTheme="minorHAnsi" w:eastAsia="MS Mincho" w:hAnsiTheme="minorHAnsi" w:cstheme="minorHAnsi"/>
+          <w:b w:val="0"/>
+          <w:sz w:val="24"/>
+          <w:szCs w:val="24"/>
+        </w:rPr>
+        <w:t>R</w:t>
+      </w:r>
+      <w:r>
+        <w:rPr>
+          <w:rFonts w:asciiTheme="minorHAnsi" w:eastAsia="MS Mincho" w:hAnsiTheme="minorHAnsi" w:cstheme="minorHAnsi"/>
+          <w:b w:val="0"/>
+          <w:sz w:val="24"/>
+          <w:szCs w:val="24"/>
+        </w:rPr>
+        <w:t>x</w:t>
+      </w:r>
+      <w:r>
+        <w:rPr>
+          <w:rFonts w:asciiTheme="minorHAnsi" w:eastAsia="MS Mincho" w:hAnsiTheme="minorHAnsi" w:cstheme="minorHAnsi"/>
+          <w:b w:val="0"/>
+          <w:sz w:val="24"/>
+          <w:szCs w:val="24"/>
+        </w:rPr>
+        <w:t>JS</w:t>
+      </w:r>
       <w:r>
         <w:rPr>
           <w:rFonts w:asciiTheme="minorHAnsi" w:eastAsia="MS Mincho" w:hAnsiTheme="minorHAnsi" w:cstheme="minorHAnsi"/>
@@ -3155,45 +3707,6 @@
         </w:rPr>
         <w:t xml:space="preserve">, </w:t>
       </w:r>
-      <w:proofErr w:type="spellStart"/>
-      <w:r>
-        <w:rPr>
-          <w:rFonts w:asciiTheme="minorHAnsi" w:eastAsia="MS Mincho" w:hAnsiTheme="minorHAnsi" w:cstheme="minorHAnsi"/>
-          <w:b w:val="0"/>
-          <w:sz w:val="24"/>
-          <w:szCs w:val="24"/>
-        </w:rPr>
-        <w:t>R</w:t>
-      </w:r>
-      <w:r>
-        <w:rPr>
-          <w:rFonts w:asciiTheme="minorHAnsi" w:eastAsia="MS Mincho" w:hAnsiTheme="minorHAnsi" w:cstheme="minorHAnsi"/>
-          <w:b w:val="0"/>
-          <w:sz w:val="24"/>
-          <w:szCs w:val="24"/>
-        </w:rPr>
-        <w:t>x</w:t>
-      </w:r>
-      <w:r>
-        <w:rPr>
-          <w:rFonts w:asciiTheme="minorHAnsi" w:eastAsia="MS Mincho" w:hAnsiTheme="minorHAnsi" w:cstheme="minorHAnsi"/>
-          <w:b w:val="0"/>
-          <w:sz w:val="24"/>
-          <w:szCs w:val="24"/>
-        </w:rPr>
-        <w:t>JS</w:t>
-      </w:r>
-      <w:proofErr w:type="spellEnd"/>
-      <w:r>
-        <w:rPr>
-          <w:rFonts w:asciiTheme="minorHAnsi" w:eastAsia="MS Mincho" w:hAnsiTheme="minorHAnsi" w:cstheme="minorHAnsi"/>
-          <w:b w:val="0"/>
-          <w:sz w:val="24"/>
-          <w:szCs w:val="24"/>
-        </w:rPr>
-        <w:t xml:space="preserve">, </w:t>
-      </w:r>
-      <w:proofErr w:type="spellStart"/>
       <w:r>
         <w:rPr>
           <w:rFonts w:asciiTheme="minorHAnsi" w:eastAsia="MS Mincho" w:hAnsiTheme="minorHAnsi" w:cstheme="minorHAnsi"/>
@@ -3212,7 +3725,6 @@
         </w:rPr>
         <w:t>odash</w:t>
       </w:r>
-      <w:proofErr w:type="spellEnd"/>
       <w:r>
         <w:rPr>
           <w:rFonts w:asciiTheme="minorHAnsi" w:eastAsia="MS Mincho" w:hAnsiTheme="minorHAnsi" w:cstheme="minorHAnsi"/>
@@ -3240,7 +3752,6 @@
         </w:rPr>
         <w:t xml:space="preserve">MongoDB, </w:t>
       </w:r>
-      <w:proofErr w:type="spellStart"/>
       <w:r>
         <w:rPr>
           <w:rFonts w:asciiTheme="minorHAnsi" w:eastAsia="MS Mincho" w:hAnsiTheme="minorHAnsi" w:cstheme="minorHAnsi"/>
@@ -3250,7 +3761,6 @@
         </w:rPr>
         <w:t>Recombee</w:t>
       </w:r>
-      <w:proofErr w:type="spellEnd"/>
       <w:r>
         <w:rPr>
           <w:rFonts w:asciiTheme="minorHAnsi" w:eastAsia="MS Mincho" w:hAnsiTheme="minorHAnsi" w:cstheme="minorHAnsi"/>
@@ -3591,18 +4101,16 @@
         </w:rPr>
         <w:t xml:space="preserve"> </w:t>
       </w:r>
-    </w:p>
-    <w:p>
-      <w:pPr>
-        <w:pStyle w:val="JobTitlebold"/>
-        <w:ind w:left="1080"/>
-        <w:rPr>
-          <w:rFonts w:asciiTheme="minorHAnsi" w:eastAsia="MS Mincho" w:hAnsiTheme="minorHAnsi" w:cstheme="minorHAnsi"/>
-          <w:b w:val="0"/>
-          <w:sz w:val="24"/>
-          <w:szCs w:val="24"/>
-        </w:rPr>
-      </w:pPr>
+      <w:r>
+        <w:rPr>
+          <w:rFonts w:asciiTheme="minorHAnsi" w:eastAsia="MS Mincho" w:hAnsiTheme="minorHAnsi" w:cstheme="minorHAnsi"/>
+          <w:b w:val="0"/>
+          <w:sz w:val="24"/>
+          <w:szCs w:val="24"/>
+        </w:rPr>
+        <w:tab/>
+        <w:t xml:space="preserve">    </w:t>
+      </w:r>
       <w:hyperlink r:id="rId13" w:history="1">
         <w:r>
           <w:rPr>
@@ -3856,7 +4364,7 @@
           <w:sz w:val="24"/>
           <w:szCs w:val="24"/>
         </w:rPr>
-        <w:t>To save energy, written</w:t>
+        <w:t xml:space="preserve">To save energy, written a multithreaded WPF desktop application </w:t>
       </w:r>
       <w:r>
         <w:rPr>
@@ -3865,7 +4373,7 @@
           <w:sz w:val="24"/>
           <w:szCs w:val="24"/>
         </w:rPr>
-        <w:t xml:space="preserve"> a multithreaded WPF desktop application </w:t>
+        <w:t>that</w:t>
       </w:r>
       <w:r>
         <w:rPr>
@@ -3874,7 +4382,7 @@
           <w:sz w:val="24"/>
           <w:szCs w:val="24"/>
         </w:rPr>
-        <w:t>that</w:t>
+        <w:t xml:space="preserve"> shut down, restart, log off, or </w:t>
       </w:r>
       <w:r>
         <w:rPr>
@@ -3883,7 +4391,7 @@
           <w:sz w:val="24"/>
           <w:szCs w:val="24"/>
         </w:rPr>
-        <w:t xml:space="preserve"> shut down, restart, log off, or </w:t>
+        <w:t>sleep the</w:t>
       </w:r>
       <w:r>
         <w:rPr>
@@ -3892,7 +4400,7 @@
           <w:sz w:val="24"/>
           <w:szCs w:val="24"/>
         </w:rPr>
-        <w:t>sleep the</w:t>
+        <w:t xml:space="preserve"> computer</w:t>
       </w:r>
       <w:r>
         <w:rPr>
@@ -3901,7 +4409,7 @@
           <w:sz w:val="24"/>
           <w:szCs w:val="24"/>
         </w:rPr>
-        <w:t xml:space="preserve"> computer </w:t>
+        <w:t>,</w:t>
       </w:r>
       <w:r>
         <w:rPr>
@@ -3910,6 +4418,15 @@
           <w:sz w:val="24"/>
           <w:szCs w:val="24"/>
         </w:rPr>
+        <w:t xml:space="preserve"> </w:t>
+      </w:r>
+      <w:r>
+        <w:rPr>
+          <w:rFonts w:eastAsia="MS Mincho"/>
+          <w:b w:val="0"/>
+          <w:sz w:val="24"/>
+          <w:szCs w:val="24"/>
+        </w:rPr>
         <w:t>following</w:t>
       </w:r>
       <w:r>
@@ -3919,7 +4436,7 @@
           <w:sz w:val="24"/>
           <w:szCs w:val="24"/>
         </w:rPr>
-        <w:t xml:space="preserve"> specific</w:t>
+        <w:t xml:space="preserve"> </w:t>
       </w:r>
       <w:r>
         <w:rPr>
@@ -3928,7 +4445,7 @@
           <w:sz w:val="24"/>
           <w:szCs w:val="24"/>
         </w:rPr>
-        <w:t xml:space="preserve"> preset</w:t>
+        <w:t>preset</w:t>
       </w:r>
       <w:r>
         <w:rPr>
@@ -3964,7 +4481,7 @@
           <w:sz w:val="24"/>
           <w:szCs w:val="24"/>
         </w:rPr>
-        <w:t xml:space="preserve"> CPU consumption of </w:t>
+        <w:t xml:space="preserve"> </w:t>
       </w:r>
       <w:r>
         <w:rPr>
@@ -3973,7 +4490,7 @@
           <w:sz w:val="24"/>
           <w:szCs w:val="24"/>
         </w:rPr>
-        <w:t>a particular</w:t>
+        <w:t>running</w:t>
       </w:r>
       <w:r>
         <w:rPr>
@@ -3982,7 +4499,16 @@
           <w:sz w:val="24"/>
           <w:szCs w:val="24"/>
         </w:rPr>
-        <w:t xml:space="preserve"> process. Th</w:t>
+        <w:t xml:space="preserve"> process </w:t>
+      </w:r>
+      <w:r>
+        <w:rPr>
+          <w:rFonts w:eastAsia="MS Mincho"/>
+          <w:b w:val="0"/>
+          <w:sz w:val="24"/>
+          <w:szCs w:val="24"/>
+        </w:rPr>
+        <w:t>CPU consumption. Th</w:t>
       </w:r>
       <w:r>
         <w:rPr>
@@ -4071,23 +4597,289 @@
     <w:p>
       <w:pPr>
         <w:pStyle w:val="JobTitlebold"/>
-        <w:ind w:left="0"/>
-        <w:rPr>
-          <w:rFonts w:asciiTheme="minorHAnsi" w:eastAsia="MS Mincho" w:hAnsiTheme="minorHAnsi"/>
-          <w:sz w:val="24"/>
-          <w:szCs w:val="24"/>
-        </w:rPr>
-      </w:pPr>
+        <w:ind w:left="1080"/>
+        <w:rPr>
+          <w:rFonts w:asciiTheme="minorHAnsi" w:eastAsia="MS Mincho" w:hAnsiTheme="minorHAnsi" w:cstheme="minorHAnsi"/>
+          <w:b w:val="0"/>
+          <w:bCs w:val="0"/>
+          <w:sz w:val="24"/>
+          <w:szCs w:val="24"/>
+        </w:rPr>
+      </w:pPr>
+      <w:r>
+        <w:rPr>
+          <w:rFonts w:asciiTheme="minorHAnsi" w:eastAsia="MS Mincho" w:hAnsiTheme="minorHAnsi" w:cstheme="minorHAnsi"/>
+          <w:b w:val="0"/>
+          <w:bCs w:val="0"/>
+          <w:sz w:val="24"/>
+          <w:szCs w:val="24"/>
+        </w:rPr>
+        <w:t xml:space="preserve">As a part </w:t>
+      </w:r>
+      <w:r>
+        <w:rPr>
+          <w:rFonts w:asciiTheme="minorHAnsi" w:eastAsia="MS Mincho" w:hAnsiTheme="minorHAnsi" w:cstheme="minorHAnsi"/>
+          <w:b w:val="0"/>
+          <w:bCs w:val="0"/>
+          <w:sz w:val="24"/>
+          <w:szCs w:val="24"/>
+        </w:rPr>
+        <w:t xml:space="preserve">of </w:t>
+      </w:r>
+      <w:r>
+        <w:rPr>
+          <w:rFonts w:asciiTheme="minorHAnsi" w:eastAsia="MS Mincho" w:hAnsiTheme="minorHAnsi" w:cstheme="minorHAnsi"/>
+          <w:b w:val="0"/>
+          <w:bCs w:val="0"/>
+          <w:sz w:val="24"/>
+          <w:szCs w:val="24"/>
+        </w:rPr>
+        <w:t xml:space="preserve">larger project, independently </w:t>
+      </w:r>
+      <w:r>
+        <w:rPr>
+          <w:rFonts w:asciiTheme="minorHAnsi" w:eastAsia="MS Mincho" w:hAnsiTheme="minorHAnsi" w:cstheme="minorHAnsi"/>
+          <w:b w:val="0"/>
+          <w:bCs w:val="0"/>
+          <w:sz w:val="24"/>
+          <w:szCs w:val="24"/>
+        </w:rPr>
+        <w:t>scraped</w:t>
+      </w:r>
+      <w:r>
+        <w:rPr>
+          <w:rFonts w:asciiTheme="minorHAnsi" w:eastAsia="MS Mincho" w:hAnsiTheme="minorHAnsi" w:cstheme="minorHAnsi"/>
+          <w:b w:val="0"/>
+          <w:bCs w:val="0"/>
+          <w:sz w:val="24"/>
+          <w:szCs w:val="24"/>
+        </w:rPr>
+        <w:t xml:space="preserve"> consistent and legible line icons</w:t>
+      </w:r>
+      <w:r>
+        <w:rPr>
+          <w:rFonts w:asciiTheme="minorHAnsi" w:eastAsia="MS Mincho" w:hAnsiTheme="minorHAnsi" w:cstheme="minorHAnsi"/>
+          <w:b w:val="0"/>
+          <w:bCs w:val="0"/>
+          <w:sz w:val="24"/>
+          <w:szCs w:val="24"/>
+        </w:rPr>
+        <w:t xml:space="preserve"> that</w:t>
+      </w:r>
+      <w:r>
+        <w:rPr>
+          <w:rFonts w:asciiTheme="minorHAnsi" w:eastAsia="MS Mincho" w:hAnsiTheme="minorHAnsi" w:cstheme="minorHAnsi"/>
+          <w:b w:val="0"/>
+          <w:bCs w:val="0"/>
+          <w:sz w:val="24"/>
+          <w:szCs w:val="24"/>
+        </w:rPr>
+        <w:t xml:space="preserve"> </w:t>
+      </w:r>
+      <w:r>
+        <w:rPr>
+          <w:rFonts w:asciiTheme="minorHAnsi" w:eastAsia="MS Mincho" w:hAnsiTheme="minorHAnsi" w:cstheme="minorHAnsi"/>
+          <w:b w:val="0"/>
+          <w:bCs w:val="0"/>
+          <w:sz w:val="24"/>
+          <w:szCs w:val="24"/>
+        </w:rPr>
+        <w:t>embellish</w:t>
+      </w:r>
+      <w:r>
+        <w:rPr>
+          <w:rFonts w:asciiTheme="minorHAnsi" w:eastAsia="MS Mincho" w:hAnsiTheme="minorHAnsi" w:cstheme="minorHAnsi"/>
+          <w:b w:val="0"/>
+          <w:bCs w:val="0"/>
+          <w:sz w:val="24"/>
+          <w:szCs w:val="24"/>
+        </w:rPr>
+        <w:t>ed</w:t>
+      </w:r>
+      <w:r>
+        <w:rPr>
+          <w:rFonts w:asciiTheme="minorHAnsi" w:eastAsia="MS Mincho" w:hAnsiTheme="minorHAnsi" w:cstheme="minorHAnsi"/>
+          <w:b w:val="0"/>
+          <w:bCs w:val="0"/>
+          <w:sz w:val="24"/>
+          <w:szCs w:val="24"/>
+        </w:rPr>
+        <w:t xml:space="preserve"> rounded corners </w:t>
+      </w:r>
+      <w:r>
+        <w:rPr>
+          <w:rFonts w:asciiTheme="minorHAnsi" w:eastAsia="MS Mincho" w:hAnsiTheme="minorHAnsi" w:cstheme="minorHAnsi"/>
+          <w:b w:val="0"/>
+          <w:bCs w:val="0"/>
+          <w:sz w:val="24"/>
+          <w:szCs w:val="24"/>
+        </w:rPr>
+        <w:t xml:space="preserve">and </w:t>
+      </w:r>
+      <w:r>
+        <w:rPr>
+          <w:rFonts w:asciiTheme="minorHAnsi" w:eastAsia="MS Mincho" w:hAnsiTheme="minorHAnsi" w:cstheme="minorHAnsi"/>
+          <w:b w:val="0"/>
+          <w:bCs w:val="0"/>
+          <w:sz w:val="24"/>
+          <w:szCs w:val="24"/>
+        </w:rPr>
+        <w:t>f</w:t>
+      </w:r>
+      <w:r>
+        <w:rPr>
+          <w:rFonts w:asciiTheme="minorHAnsi" w:eastAsia="MS Mincho" w:hAnsiTheme="minorHAnsi" w:cstheme="minorHAnsi"/>
+          <w:b w:val="0"/>
+          <w:bCs w:val="0"/>
+          <w:sz w:val="24"/>
+          <w:szCs w:val="24"/>
+        </w:rPr>
+        <w:t>unction</w:t>
+      </w:r>
+      <w:r>
+        <w:rPr>
+          <w:rFonts w:asciiTheme="minorHAnsi" w:eastAsia="MS Mincho" w:hAnsiTheme="minorHAnsi" w:cstheme="minorHAnsi"/>
+          <w:b w:val="0"/>
+          <w:bCs w:val="0"/>
+          <w:sz w:val="24"/>
+          <w:szCs w:val="24"/>
+        </w:rPr>
+        <w:t>ed</w:t>
+      </w:r>
+      <w:r>
+        <w:rPr>
+          <w:rFonts w:asciiTheme="minorHAnsi" w:eastAsia="MS Mincho" w:hAnsiTheme="minorHAnsi" w:cstheme="minorHAnsi"/>
+          <w:b w:val="0"/>
+          <w:bCs w:val="0"/>
+          <w:sz w:val="24"/>
+          <w:szCs w:val="24"/>
+        </w:rPr>
+        <w:t xml:space="preserve"> as</w:t>
+      </w:r>
+      <w:r>
+        <w:rPr>
+          <w:rFonts w:asciiTheme="minorHAnsi" w:eastAsia="MS Mincho" w:hAnsiTheme="minorHAnsi" w:cstheme="minorHAnsi"/>
+          <w:b w:val="0"/>
+          <w:bCs w:val="0"/>
+          <w:sz w:val="24"/>
+          <w:szCs w:val="24"/>
+        </w:rPr>
+        <w:t xml:space="preserve"> </w:t>
+      </w:r>
+      <w:r>
+        <w:rPr>
+          <w:rFonts w:asciiTheme="minorHAnsi" w:eastAsia="MS Mincho" w:hAnsiTheme="minorHAnsi" w:cstheme="minorHAnsi"/>
+          <w:b w:val="0"/>
+          <w:bCs w:val="0"/>
+          <w:sz w:val="24"/>
+          <w:szCs w:val="24"/>
+        </w:rPr>
+        <w:t>video player</w:t>
+      </w:r>
+      <w:r>
+        <w:rPr>
+          <w:rFonts w:asciiTheme="minorHAnsi" w:eastAsia="MS Mincho" w:hAnsiTheme="minorHAnsi" w:cstheme="minorHAnsi"/>
+          <w:b w:val="0"/>
+          <w:bCs w:val="0"/>
+          <w:sz w:val="24"/>
+          <w:szCs w:val="24"/>
+        </w:rPr>
+        <w:t xml:space="preserve"> controls</w:t>
+      </w:r>
+      <w:r>
+        <w:rPr>
+          <w:rFonts w:asciiTheme="minorHAnsi" w:eastAsia="MS Mincho" w:hAnsiTheme="minorHAnsi" w:cstheme="minorHAnsi"/>
+          <w:b w:val="0"/>
+          <w:bCs w:val="0"/>
+          <w:sz w:val="24"/>
+          <w:szCs w:val="24"/>
+        </w:rPr>
+        <w:t xml:space="preserve">. The icon font generation </w:t>
+      </w:r>
+      <w:r>
+        <w:rPr>
+          <w:rFonts w:asciiTheme="minorHAnsi" w:eastAsia="MS Mincho" w:hAnsiTheme="minorHAnsi" w:cstheme="minorHAnsi"/>
+          <w:b w:val="0"/>
+          <w:bCs w:val="0"/>
+          <w:sz w:val="24"/>
+          <w:szCs w:val="24"/>
+        </w:rPr>
+        <w:t>archive</w:t>
+      </w:r>
+      <w:r>
+        <w:rPr>
+          <w:rFonts w:asciiTheme="minorHAnsi" w:eastAsia="MS Mincho" w:hAnsiTheme="minorHAnsi" w:cstheme="minorHAnsi"/>
+          <w:b w:val="0"/>
+          <w:bCs w:val="0"/>
+          <w:sz w:val="24"/>
+          <w:szCs w:val="24"/>
+        </w:rPr>
+        <w:t xml:space="preserve"> </w:t>
+      </w:r>
+      <w:r>
+        <w:rPr>
+          <w:rFonts w:asciiTheme="minorHAnsi" w:eastAsia="MS Mincho" w:hAnsiTheme="minorHAnsi" w:cstheme="minorHAnsi"/>
+          <w:b w:val="0"/>
+          <w:bCs w:val="0"/>
+          <w:sz w:val="24"/>
+          <w:szCs w:val="24"/>
+        </w:rPr>
+        <w:t xml:space="preserve">containing </w:t>
+      </w:r>
+      <w:r>
+        <w:rPr>
+          <w:rFonts w:asciiTheme="minorHAnsi" w:eastAsia="MS Mincho" w:hAnsiTheme="minorHAnsi" w:cstheme="minorHAnsi"/>
+          <w:b w:val="0"/>
+          <w:bCs w:val="0"/>
+          <w:sz w:val="24"/>
+          <w:szCs w:val="24"/>
+        </w:rPr>
+        <w:t xml:space="preserve">those custom icons is </w:t>
+      </w:r>
+      <w:r>
+        <w:rPr>
+          <w:rFonts w:asciiTheme="minorHAnsi" w:eastAsia="MS Mincho" w:hAnsiTheme="minorHAnsi" w:cstheme="minorHAnsi"/>
+          <w:b w:val="0"/>
+          <w:bCs w:val="0"/>
+          <w:sz w:val="24"/>
+          <w:szCs w:val="24"/>
+        </w:rPr>
+        <w:t>at</w:t>
+      </w:r>
+      <w:r>
+        <w:rPr>
+          <w:rFonts w:asciiTheme="minorHAnsi" w:eastAsia="MS Mincho" w:hAnsiTheme="minorHAnsi" w:cstheme="minorHAnsi"/>
+          <w:b w:val="0"/>
+          <w:bCs w:val="0"/>
+          <w:sz w:val="24"/>
+          <w:szCs w:val="24"/>
+        </w:rPr>
+        <w:t>:</w:t>
+      </w:r>
     </w:p>
     <w:p>
       <w:pPr>
         <w:pStyle w:val="JobTitlebold"/>
+        <w:ind w:left="1080"/>
         <w:rPr>
           <w:rFonts w:asciiTheme="minorHAnsi" w:eastAsia="MS Mincho" w:hAnsiTheme="minorHAnsi"/>
           <w:sz w:val="24"/>
           <w:szCs w:val="24"/>
         </w:rPr>
       </w:pPr>
+      <w:hyperlink r:id="rId15" w:history="1">
+        <w:r>
+          <w:rPr>
+            <w:rStyle w:val="Hyperlink"/>
+            <w:rFonts w:asciiTheme="minorHAnsi" w:eastAsia="MS Mincho" w:hAnsiTheme="minorHAnsi" w:cstheme="minorHAnsi"/>
+            <w:b w:val="0"/>
+            <w:bCs w:val="0"/>
+            <w:sz w:val="24"/>
+            <w:szCs w:val="24"/>
+          </w:rPr>
+          <w:t>https://github.com/prateekrastogi/videojs-icon-font</w:t>
+        </w:r>
+      </w:hyperlink>
     </w:p>
     <w:sectPr>
       <w:pgSz w:w="12240" w:h="15840"/>
@@ -4160,56 +4952,56 @@
         <v:path o:extrusionok="f" gradientshapeok="t" o:connecttype="rect"/>
         <o:lock v:ext="edit" aspectratio="t"/>
       </v:shapetype>
-      <v:shape id="_x0000_i1304" type="#_x0000_t75" style="width:11.4pt;height:11.4pt" o:bullet="t">
+      <v:shape id="_x0000_i1674" type="#_x0000_t75" style="width:11.4pt;height:11.4pt" o:bullet="t">
         <v:imagedata r:id="rId1" o:title="BD14578_"/>
       </v:shape>
     </w:pict>
   </w:numPicBullet>
   <w:numPicBullet w:numPicBulletId="1">
     <w:pict>
-      <v:shape id="_x0000_i1305" type="#_x0000_t75" style="width:11.4pt;height:11.4pt" o:bullet="t">
+      <v:shape id="_x0000_i1675" type="#_x0000_t75" style="width:11.4pt;height:11.4pt" o:bullet="t">
         <v:imagedata r:id="rId2" o:title="BD21375_"/>
       </v:shape>
     </w:pict>
   </w:numPicBullet>
   <w:numPicBullet w:numPicBulletId="2">
     <w:pict>
-      <v:shape id="_x0000_i1306" type="#_x0000_t75" style="width:10.8pt;height:10.8pt" o:bullet="t">
+      <v:shape id="_x0000_i1676" type="#_x0000_t75" style="width:10.8pt;height:10.8pt" o:bullet="t">
         <v:imagedata r:id="rId3" o:title="BD21297_"/>
       </v:shape>
     </w:pict>
   </w:numPicBullet>
   <w:numPicBullet w:numPicBulletId="3">
     <w:pict>
-      <v:shape id="_x0000_i1307" type="#_x0000_t75" style="width:11.4pt;height:11.4pt" o:bullet="t">
+      <v:shape id="_x0000_i1677" type="#_x0000_t75" style="width:11.4pt;height:11.4pt" o:bullet="t">
         <v:imagedata r:id="rId4" o:title="BD14753_"/>
       </v:shape>
     </w:pict>
   </w:numPicBullet>
   <w:numPicBullet w:numPicBulletId="4">
     <w:pict>
-      <v:shape id="_x0000_i1308" type="#_x0000_t75" style="width:10.8pt;height:10.8pt" o:bullet="t">
+      <v:shape id="_x0000_i1678" type="#_x0000_t75" style="width:10.8pt;height:10.8pt" o:bullet="t">
         <v:imagedata r:id="rId5" o:title="BD21504_"/>
       </v:shape>
     </w:pict>
   </w:numPicBullet>
   <w:numPicBullet w:numPicBulletId="5">
     <w:pict>
-      <v:shape id="_x0000_i1309" type="#_x0000_t75" style="width:11.4pt;height:8.4pt" o:bullet="t">
+      <v:shape id="_x0000_i1679" type="#_x0000_t75" style="width:11.4pt;height:8.4pt" o:bullet="t">
         <v:imagedata r:id="rId6" o:title="BD21299_"/>
       </v:shape>
     </w:pict>
   </w:numPicBullet>
   <w:numPicBullet w:numPicBulletId="6">
     <w:pict>
-      <v:shape id="_x0000_i1310" type="#_x0000_t75" style="width:33.6pt;height:27pt" o:bullet="t">
+      <v:shape id="_x0000_i1680" type="#_x0000_t75" style="width:33.6pt;height:27pt" o:bullet="t">
         <v:imagedata r:id="rId7" o:title="Capture"/>
       </v:shape>
     </w:pict>
   </w:numPicBullet>
   <w:numPicBullet w:numPicBulletId="7">
     <w:pict>
-      <v:shape w14:anchorId="7FA011DF" id="_x0000_i1311" type="#_x0000_t75" style="width:15pt;height:15pt" o:bullet="t">
+      <v:shape id="_x0000_i1681" type="#_x0000_t75" style="width:15pt;height:15pt" o:bullet="t">
         <v:imagedata r:id="rId8" o:title="Capture"/>
       </v:shape>
     </w:pict>
@@ -9362,15 +10154,6 @@
   </w:num>
   <w:num w:numId="45">
     <w:abstractNumId w:val="26"/>
-    <w:lvlOverride w:ilvl="0"/>
-    <w:lvlOverride w:ilvl="1"/>
-    <w:lvlOverride w:ilvl="2"/>
-    <w:lvlOverride w:ilvl="3"/>
-    <w:lvlOverride w:ilvl="4"/>
-    <w:lvlOverride w:ilvl="5"/>
-    <w:lvlOverride w:ilvl="6"/>
-    <w:lvlOverride w:ilvl="7"/>
-    <w:lvlOverride w:ilvl="8"/>
   </w:num>
   <w:numIdMacAtCleanup w:val="2"/>
 </w:numbering>
@@ -10535,6 +11318,15 @@
 </file>
 
 <file path=customXml/item1.xml><?xml version="1.0" encoding="utf-8"?>
+<?mso-contentType ?>
+<FormTemplates xmlns="http://schemas.microsoft.com/sharepoint/v3/contenttype/forms">
+  <Display>DocumentLibraryForm</Display>
+  <Edit>AssetEditForm</Edit>
+  <New>DocumentLibraryForm</New>
+</FormTemplates>
+</file>
+
+<file path=customXml/item2.xml><?xml version="1.0" encoding="utf-8"?>
 <MonsterProperties xmlns:xsi="http://www.w3.org/2001/XMLSchema-instance" xmlns:xsd="http://www.w3.org/2001/XMLSchema" xmlns="http://schemas.monster.com/Monster/Seeker/WordResumeTemplates">
   <AtlasTagging>
     <ResumeUploadSuccessTag>monmon_EZSubmitFinalUpload_1</ResumeUploadSuccessTag>
@@ -10547,20 +11339,19 @@
 </MonsterProperties>
 </file>
 
-<file path=customXml/item2.xml><?xml version="1.0" encoding="utf-8"?>
-<?mso-contentType ?>
-<FormTemplates xmlns="http://schemas.microsoft.com/sharepoint/v3/contenttype/forms">
-  <Display>DocumentLibraryForm</Display>
-  <Edit>AssetEditForm</Edit>
-  <New>DocumentLibraryForm</New>
-</FormTemplates>
-</file>
-
 <file path=customXml/item3.xml><?xml version="1.0" encoding="utf-8"?>
 <b:Sources xmlns:b="http://schemas.openxmlformats.org/officeDocument/2006/bibliography" xmlns="http://schemas.openxmlformats.org/officeDocument/2006/bibliography" SelectedStyle="\APA.XSL" StyleName="APA"/>
 </file>
 
 <file path=customXml/itemProps1.xml><?xml version="1.0" encoding="utf-8"?>
+<ds:datastoreItem xmlns:ds="http://schemas.openxmlformats.org/officeDocument/2006/customXml" ds:itemID="{5DEE6487-3BB8-4831-A84A-EA72C011E7B1}">
+  <ds:schemaRefs>
+    <ds:schemaRef ds:uri="http://schemas.microsoft.com/sharepoint/v3/contenttype/forms"/>
+  </ds:schemaRefs>
+</ds:datastoreItem>
+</file>
+
+<file path=customXml/itemProps2.xml><?xml version="1.0" encoding="utf-8"?>
 <ds:datastoreItem xmlns:ds="http://schemas.openxmlformats.org/officeDocument/2006/customXml" ds:itemID="{6413E27A-9F10-4D79-BB65-07392FAEAA39}">
   <ds:schemaRefs>
     <ds:schemaRef ds:uri="http://www.w3.org/2001/XMLSchema"/>
@@ -10569,16 +11360,8 @@
 </ds:datastoreItem>
 </file>
 
-<file path=customXml/itemProps2.xml><?xml version="1.0" encoding="utf-8"?>
-<ds:datastoreItem xmlns:ds="http://schemas.openxmlformats.org/officeDocument/2006/customXml" ds:itemID="{5DEE6487-3BB8-4831-A84A-EA72C011E7B1}">
-  <ds:schemaRefs>
-    <ds:schemaRef ds:uri="http://schemas.microsoft.com/sharepoint/v3/contenttype/forms"/>
-  </ds:schemaRefs>
-</ds:datastoreItem>
-</file>
-
 <file path=customXml/itemProps3.xml><?xml version="1.0" encoding="utf-8"?>
-<ds:datastoreItem xmlns:ds="http://schemas.openxmlformats.org/officeDocument/2006/customXml" ds:itemID="{CAEDAA84-E591-43E7-88EB-010F220276F8}">
+<ds:datastoreItem xmlns:ds="http://schemas.openxmlformats.org/officeDocument/2006/customXml" ds:itemID="{47A9BA4D-189B-4497-9800-18EE5D5D830C}">
   <ds:schemaRefs>
     <ds:schemaRef ds:uri="http://schemas.openxmlformats.org/officeDocument/2006/bibliography"/>
   </ds:schemaRefs>

</xml_diff>

<commit_message>
converted job experience durations to the format *y *m
</commit_message>
<xml_diff>
--- a/Prateek Rastogi-Current.docx
+++ b/Prateek Rastogi-Current.docx
@@ -76,7 +76,7 @@
         <mc:AlternateContent>
           <mc:Choice Requires="wps">
             <w:drawing>
-              <wp:anchor distT="0" distB="0" distL="114300" distR="114300" simplePos="0" relativeHeight="251703296" behindDoc="0" locked="0" layoutInCell="1" allowOverlap="1" wp14:anchorId="7FA011DB" wp14:editId="29554484">
+              <wp:anchor distT="0" distB="0" distL="114300" distR="114300" simplePos="0" relativeHeight="251703296" behindDoc="0" locked="0" layoutInCell="1" allowOverlap="1" wp14:anchorId="7FA011DB" wp14:editId="0F00D311">
                 <wp:simplePos x="0" y="0"/>
                 <wp:positionH relativeFrom="margin">
                   <wp:align>left</wp:align>
@@ -140,7 +140,7 @@
           </mc:Choice>
           <mc:Fallback>
             <w:pict>
-              <v:line w14:anchorId="26EF87A6" id="Line 2" o:spid="_x0000_s1026" style="position:absolute;flip:x;z-index:251703296;visibility:visible;mso-wrap-style:square;mso-width-percent:0;mso-height-percent:0;mso-wrap-distance-left:9pt;mso-wrap-distance-top:0;mso-wrap-distance-right:9pt;mso-wrap-distance-bottom:0;mso-position-horizontal:left;mso-position-horizontal-relative:margin;mso-position-vertical:top;mso-position-vertical-relative:margin;mso-width-percent:0;mso-height-percent:0;mso-width-relative:page;mso-height-relative:page" from="0,0" to="0,698.4pt" o:gfxdata="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" strokecolor="#2f5897 [3215]" strokeweight="5.25pt">
+              <v:line w14:anchorId="56709378" id="Line 2" o:spid="_x0000_s1026" style="position:absolute;flip:x;z-index:251703296;visibility:visible;mso-wrap-style:square;mso-width-percent:0;mso-height-percent:0;mso-wrap-distance-left:9pt;mso-wrap-distance-top:0;mso-wrap-distance-right:9pt;mso-wrap-distance-bottom:0;mso-position-horizontal:left;mso-position-horizontal-relative:margin;mso-position-vertical:top;mso-position-vertical-relative:margin;mso-width-percent:0;mso-height-percent:0;mso-width-relative:page;mso-height-relative:page" from="0,0" to="0,698.4pt" o:gfxdata="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" strokecolor="#2f5897 [3215]" strokeweight="5.25pt">
                 <w10:wrap anchorx="margin" anchory="margin"/>
               </v:line>
             </w:pict>
@@ -371,7 +371,7 @@
           <w:sz w:val="24"/>
           <w:szCs w:val="24"/>
         </w:rPr>
-        <w:t>192</w:t>
+        <w:t>1403</w:t>
       </w:r>
       <w:r>
         <w:rPr>
@@ -395,7 +395,16 @@
           <w:sz w:val="24"/>
           <w:szCs w:val="24"/>
         </w:rPr>
-        <w:t>Peptech City</w:t>
+        <w:t xml:space="preserve">Tower KM </w:t>
+      </w:r>
+      <w:proofErr w:type="gramStart"/>
+      <w:r>
+        <w:rPr>
+          <w:rFonts w:asciiTheme="majorHAnsi" w:eastAsia="MS Mincho" w:hAnsiTheme="majorHAnsi"/>
+          <w:sz w:val="24"/>
+          <w:szCs w:val="24"/>
+        </w:rPr>
+        <w:t>3</w:t>
       </w:r>
       <w:r>
         <w:rPr>
@@ -419,7 +428,16 @@
           <w:sz w:val="24"/>
           <w:szCs w:val="24"/>
         </w:rPr>
-        <w:t xml:space="preserve">    </w:t>
+        <w:t xml:space="preserve"> </w:t>
+      </w:r>
+      <w:proofErr w:type="gramEnd"/>
+      <w:r>
+        <w:rPr>
+          <w:rFonts w:asciiTheme="majorHAnsi" w:eastAsia="MS Mincho" w:hAnsiTheme="majorHAnsi"/>
+          <w:sz w:val="24"/>
+          <w:szCs w:val="24"/>
+        </w:rPr>
+        <w:t xml:space="preserve">   </w:t>
       </w:r>
       <w:r>
         <w:rPr>
@@ -552,8 +570,18 @@
           <w:sz w:val="24"/>
           <w:szCs w:val="24"/>
         </w:rPr>
-        <w:t>Sohawal</w:t>
-      </w:r>
+        <w:t xml:space="preserve">Jaypee </w:t>
+      </w:r>
+      <w:proofErr w:type="spellStart"/>
+      <w:r>
+        <w:rPr>
+          <w:rFonts w:asciiTheme="majorHAnsi" w:eastAsia="MS Mincho" w:hAnsiTheme="majorHAnsi"/>
+          <w:sz w:val="24"/>
+          <w:szCs w:val="24"/>
+        </w:rPr>
+        <w:t>Kosmos</w:t>
+      </w:r>
+      <w:proofErr w:type="spellEnd"/>
       <w:r>
         <w:rPr>
           <w:rFonts w:asciiTheme="majorHAnsi" w:eastAsia="MS Mincho" w:hAnsiTheme="majorHAnsi"/>
@@ -568,15 +596,7 @@
           <w:sz w:val="24"/>
           <w:szCs w:val="24"/>
         </w:rPr>
-        <w:t xml:space="preserve"> </w:t>
-      </w:r>
-      <w:r>
-        <w:rPr>
-          <w:rFonts w:asciiTheme="majorHAnsi" w:eastAsia="MS Mincho" w:hAnsiTheme="majorHAnsi"/>
-          <w:sz w:val="24"/>
-          <w:szCs w:val="24"/>
-        </w:rPr>
-        <w:t>Satna</w:t>
+        <w:t xml:space="preserve"> Noida</w:t>
       </w:r>
       <w:r>
         <w:rPr>
@@ -682,6 +702,7 @@
         </w:rPr>
         <w:t xml:space="preserve">      </w:t>
       </w:r>
+      <w:proofErr w:type="gramStart"/>
       <w:r>
         <w:rPr>
           <w:rFonts w:asciiTheme="majorHAnsi" w:eastAsia="MS Mincho" w:hAnsiTheme="majorHAnsi"/>
@@ -698,6 +719,7 @@
         </w:rPr>
         <w:t xml:space="preserve">  </w:t>
       </w:r>
+      <w:proofErr w:type="gramEnd"/>
       <w:r>
         <w:rPr>
           <w:rFonts w:asciiTheme="majorHAnsi" w:eastAsia="MS Mincho" w:hAnsiTheme="majorHAnsi"/>
@@ -806,23 +828,7 @@
           <w:sz w:val="24"/>
           <w:szCs w:val="24"/>
         </w:rPr>
-        <w:t>4854</w:t>
-      </w:r>
-      <w:r>
-        <w:rPr>
-          <w:rFonts w:asciiTheme="majorHAnsi" w:eastAsia="MS Mincho" w:hAnsiTheme="majorHAnsi"/>
-          <w:sz w:val="24"/>
-          <w:szCs w:val="24"/>
-        </w:rPr>
-        <w:t>4</w:t>
-      </w:r>
-      <w:r>
-        <w:rPr>
-          <w:rFonts w:asciiTheme="majorHAnsi" w:eastAsia="MS Mincho" w:hAnsiTheme="majorHAnsi"/>
-          <w:sz w:val="24"/>
-          <w:szCs w:val="24"/>
-        </w:rPr>
-        <w:t>1</w:t>
+        <w:t>201305</w:t>
       </w:r>
       <w:r>
         <w:rPr>
@@ -1187,15 +1193,47 @@
           <w:sz w:val="24"/>
           <w:szCs w:val="24"/>
         </w:rPr>
-        <w:t xml:space="preserve">             </w:t>
-      </w:r>
-      <w:r>
-        <w:rPr>
-          <w:rFonts w:asciiTheme="majorHAnsi" w:eastAsia="MS Mincho" w:hAnsiTheme="majorHAnsi"/>
-          <w:sz w:val="24"/>
-          <w:szCs w:val="24"/>
-        </w:rPr>
-        <w:t>Nov’17-Feb’19</w:t>
+        <w:tab/>
+      </w:r>
+      <w:r>
+        <w:rPr>
+          <w:rFonts w:asciiTheme="majorHAnsi" w:eastAsia="MS Mincho" w:hAnsiTheme="majorHAnsi"/>
+          <w:sz w:val="24"/>
+          <w:szCs w:val="24"/>
+        </w:rPr>
+        <w:tab/>
+      </w:r>
+      <w:r>
+        <w:rPr>
+          <w:rFonts w:asciiTheme="majorHAnsi" w:eastAsia="MS Mincho" w:hAnsiTheme="majorHAnsi"/>
+          <w:sz w:val="24"/>
+          <w:szCs w:val="24"/>
+        </w:rPr>
+        <w:tab/>
+      </w:r>
+      <w:r>
+        <w:rPr>
+          <w:rFonts w:asciiTheme="majorHAnsi" w:eastAsia="MS Mincho" w:hAnsiTheme="majorHAnsi"/>
+          <w:sz w:val="24"/>
+          <w:szCs w:val="24"/>
+        </w:rPr>
+        <w:t xml:space="preserve">1y </w:t>
+      </w:r>
+      <w:r>
+        <w:rPr>
+          <w:rFonts w:asciiTheme="majorHAnsi" w:eastAsia="MS Mincho" w:hAnsiTheme="majorHAnsi"/>
+          <w:sz w:val="24"/>
+          <w:szCs w:val="24"/>
+        </w:rPr>
+        <w:t>4</w:t>
+      </w:r>
+      <w:r>
+        <w:rPr>
+          <w:rFonts w:asciiTheme="majorHAnsi" w:eastAsia="MS Mincho" w:hAnsiTheme="majorHAnsi"/>
+          <w:sz w:val="24"/>
+          <w:szCs w:val="24"/>
+        </w:rPr>
+        <w:t>m</w:t>
       </w:r>
       <w:r>
         <w:rPr>
@@ -1260,16 +1298,43 @@
           <w:sz w:val="24"/>
           <w:szCs w:val="24"/>
         </w:rPr>
-        <w:t xml:space="preserve">Frontend Developer, but my role </w:t>
-      </w:r>
-      <w:r>
-        <w:rPr>
-          <w:rFonts w:eastAsia="MS Mincho"/>
-          <w:b w:val="0"/>
-          <w:sz w:val="24"/>
-          <w:szCs w:val="24"/>
-        </w:rPr>
-        <w:t>eventually</w:t>
+        <w:t xml:space="preserve">Frontend Developer, </w:t>
+      </w:r>
+      <w:r>
+        <w:rPr>
+          <w:rFonts w:eastAsia="MS Mincho"/>
+          <w:b w:val="0"/>
+          <w:sz w:val="24"/>
+          <w:szCs w:val="24"/>
+        </w:rPr>
+        <w:t xml:space="preserve">with </w:t>
+      </w:r>
+      <w:r>
+        <w:rPr>
+          <w:rFonts w:eastAsia="MS Mincho"/>
+          <w:b w:val="0"/>
+          <w:sz w:val="24"/>
+          <w:szCs w:val="24"/>
+        </w:rPr>
+        <w:t>my</w:t>
+      </w:r>
+      <w:r>
+        <w:rPr>
+          <w:rFonts w:eastAsia="MS Mincho"/>
+          <w:b w:val="0"/>
+          <w:sz w:val="24"/>
+          <w:szCs w:val="24"/>
+        </w:rPr>
+        <w:t xml:space="preserve"> eventual</w:t>
+      </w:r>
+      <w:r>
+        <w:rPr>
+          <w:rFonts w:eastAsia="MS Mincho"/>
+          <w:b w:val="0"/>
+          <w:sz w:val="24"/>
+          <w:szCs w:val="24"/>
+        </w:rPr>
+        <w:t xml:space="preserve"> role</w:t>
       </w:r>
       <w:r>
         <w:rPr>
@@ -1287,34 +1352,7 @@
           <w:sz w:val="24"/>
           <w:szCs w:val="24"/>
         </w:rPr>
-        <w:t>morphed in</w:t>
-      </w:r>
-      <w:r>
-        <w:rPr>
-          <w:rFonts w:eastAsia="MS Mincho"/>
-          <w:b w:val="0"/>
-          <w:sz w:val="24"/>
-          <w:szCs w:val="24"/>
-        </w:rPr>
-        <w:t xml:space="preserve">to </w:t>
-      </w:r>
-      <w:r>
-        <w:rPr>
-          <w:rFonts w:eastAsia="MS Mincho"/>
-          <w:b w:val="0"/>
-          <w:sz w:val="24"/>
-          <w:szCs w:val="24"/>
-        </w:rPr>
-        <w:t>business</w:t>
-      </w:r>
-      <w:r>
-        <w:rPr>
-          <w:rFonts w:eastAsia="MS Mincho"/>
-          <w:b w:val="0"/>
-          <w:sz w:val="24"/>
-          <w:szCs w:val="24"/>
-        </w:rPr>
-        <w:t xml:space="preserve"> unit</w:t>
+        <w:t>being</w:t>
       </w:r>
       <w:r>
         <w:rPr>
@@ -1332,16 +1370,16 @@
           <w:sz w:val="24"/>
           <w:szCs w:val="24"/>
         </w:rPr>
-        <w:t>tech strategy</w:t>
-      </w:r>
-      <w:r>
-        <w:rPr>
-          <w:rFonts w:eastAsia="MS Mincho"/>
-          <w:b w:val="0"/>
-          <w:sz w:val="24"/>
-          <w:szCs w:val="24"/>
-        </w:rPr>
-        <w:t xml:space="preserve"> supervision</w:t>
+        <w:t xml:space="preserve">     cross-</w:t>
+      </w:r>
+      <w:r>
+        <w:rPr>
+          <w:rFonts w:eastAsia="MS Mincho"/>
+          <w:b w:val="0"/>
+          <w:sz w:val="24"/>
+          <w:szCs w:val="24"/>
+        </w:rPr>
+        <w:t>domain</w:t>
       </w:r>
       <w:r>
         <w:rPr>
@@ -1359,16 +1397,16 @@
           <w:sz w:val="24"/>
           <w:szCs w:val="24"/>
         </w:rPr>
-        <w:t>through</w:t>
-      </w:r>
-      <w:r>
-        <w:rPr>
-          <w:rFonts w:eastAsia="MS Mincho"/>
-          <w:b w:val="0"/>
-          <w:sz w:val="24"/>
-          <w:szCs w:val="24"/>
-        </w:rPr>
-        <w:t xml:space="preserve"> proof of concept</w:t>
+        <w:t>tech</w:t>
+      </w:r>
+      <w:r>
+        <w:rPr>
+          <w:rFonts w:eastAsia="MS Mincho"/>
+          <w:b w:val="0"/>
+          <w:sz w:val="24"/>
+          <w:szCs w:val="24"/>
+        </w:rPr>
+        <w:t xml:space="preserve"> orchestration</w:t>
       </w:r>
       <w:r>
         <w:rPr>
@@ -1386,16 +1424,16 @@
           <w:sz w:val="24"/>
           <w:szCs w:val="24"/>
         </w:rPr>
-        <w:t>demonstration</w:t>
-      </w:r>
-      <w:r>
-        <w:rPr>
-          <w:rFonts w:eastAsia="MS Mincho"/>
-          <w:b w:val="0"/>
-          <w:sz w:val="24"/>
-          <w:szCs w:val="24"/>
-        </w:rPr>
-        <w:t>s</w:t>
+        <w:t xml:space="preserve">by </w:t>
+      </w:r>
+      <w:r>
+        <w:rPr>
+          <w:rFonts w:eastAsia="MS Mincho"/>
+          <w:b w:val="0"/>
+          <w:sz w:val="24"/>
+          <w:szCs w:val="24"/>
+        </w:rPr>
+        <w:t>engraving</w:t>
       </w:r>
       <w:r>
         <w:rPr>
@@ -1413,7 +1451,25 @@
           <w:sz w:val="24"/>
           <w:szCs w:val="24"/>
         </w:rPr>
-        <w:t>engraving</w:t>
+        <w:t>cutting-edge</w:t>
+      </w:r>
+      <w:r>
+        <w:rPr>
+          <w:rFonts w:eastAsia="MS Mincho"/>
+          <w:b w:val="0"/>
+          <w:sz w:val="24"/>
+          <w:szCs w:val="24"/>
+        </w:rPr>
+        <w:t xml:space="preserve"> technologies</w:t>
+      </w:r>
+      <w:r>
+        <w:rPr>
+          <w:rFonts w:eastAsia="MS Mincho"/>
+          <w:b w:val="0"/>
+          <w:sz w:val="24"/>
+          <w:szCs w:val="24"/>
+        </w:rPr>
+        <w:t xml:space="preserve"> such as</w:t>
       </w:r>
       <w:r>
         <w:rPr>
@@ -1431,25 +1487,7 @@
           <w:sz w:val="24"/>
           <w:szCs w:val="24"/>
         </w:rPr>
-        <w:t>cutting-edge</w:t>
-      </w:r>
-      <w:r>
-        <w:rPr>
-          <w:rFonts w:eastAsia="MS Mincho"/>
-          <w:b w:val="0"/>
-          <w:sz w:val="24"/>
-          <w:szCs w:val="24"/>
-        </w:rPr>
-        <w:t xml:space="preserve"> technologies</w:t>
-      </w:r>
-      <w:r>
-        <w:rPr>
-          <w:rFonts w:eastAsia="MS Mincho"/>
-          <w:b w:val="0"/>
-          <w:sz w:val="24"/>
-          <w:szCs w:val="24"/>
-        </w:rPr>
-        <w:t xml:space="preserve"> such as </w:t>
+        <w:t xml:space="preserve">            </w:t>
       </w:r>
       <w:hyperlink r:id="rId11" w:history="1">
         <w:r>
@@ -1465,14 +1503,25 @@
       </w:hyperlink>
       <w:r>
         <w:rPr>
-          <w:rFonts w:eastAsia="MS Mincho"/>
-          <w:b w:val="0"/>
-          <w:sz w:val="24"/>
-          <w:szCs w:val="24"/>
-        </w:rPr>
-        <w:t xml:space="preserve">, </w:t>
+          <w:rStyle w:val="Hyperlink"/>
+          <w:rFonts w:eastAsia="MS Mincho"/>
+          <w:b w:val="0"/>
+          <w:sz w:val="24"/>
+          <w:szCs w:val="24"/>
+        </w:rPr>
+        <w:t xml:space="preserve"> </w:t>
+      </w:r>
+      <w:r>
+        <w:rPr>
+          <w:rFonts w:eastAsia="MS Mincho"/>
+          <w:b w:val="0"/>
+          <w:sz w:val="24"/>
+          <w:szCs w:val="24"/>
+        </w:rPr>
+        <w:t xml:space="preserve">(React), </w:t>
       </w:r>
       <w:hyperlink r:id="rId12" w:history="1">
+        <w:proofErr w:type="spellStart"/>
         <w:r>
           <w:rPr>
             <w:rStyle w:val="Hyperlink"/>
@@ -1483,15 +1532,53 @@
           </w:rPr>
           <w:t>LoopBack</w:t>
         </w:r>
+        <w:proofErr w:type="spellEnd"/>
       </w:hyperlink>
       <w:r>
         <w:rPr>
-          <w:rFonts w:eastAsia="MS Mincho"/>
-          <w:b w:val="0"/>
-          <w:sz w:val="24"/>
-          <w:szCs w:val="24"/>
-        </w:rPr>
-        <w:t xml:space="preserve">, and </w:t>
+          <w:rStyle w:val="Hyperlink"/>
+          <w:rFonts w:eastAsia="MS Mincho"/>
+          <w:b w:val="0"/>
+          <w:sz w:val="24"/>
+          <w:szCs w:val="24"/>
+        </w:rPr>
+        <w:t xml:space="preserve"> </w:t>
+      </w:r>
+      <w:r>
+        <w:rPr>
+          <w:rFonts w:eastAsia="MS Mincho"/>
+          <w:b w:val="0"/>
+          <w:sz w:val="24"/>
+          <w:szCs w:val="24"/>
+        </w:rPr>
+        <w:t>(Node</w:t>
+      </w:r>
+      <w:r>
+        <w:rPr>
+          <w:rFonts w:eastAsia="MS Mincho"/>
+          <w:b w:val="0"/>
+          <w:sz w:val="24"/>
+          <w:szCs w:val="24"/>
+        </w:rPr>
+        <w:t>.</w:t>
+      </w:r>
+      <w:r>
+        <w:rPr>
+          <w:rFonts w:eastAsia="MS Mincho"/>
+          <w:b w:val="0"/>
+          <w:sz w:val="24"/>
+          <w:szCs w:val="24"/>
+        </w:rPr>
+        <w:t>js),</w:t>
+      </w:r>
+      <w:r>
+        <w:rPr>
+          <w:rFonts w:eastAsia="MS Mincho"/>
+          <w:b w:val="0"/>
+          <w:sz w:val="24"/>
+          <w:szCs w:val="24"/>
+        </w:rPr>
+        <w:t xml:space="preserve"> and </w:t>
       </w:r>
       <w:hyperlink r:id="rId13" w:history="1">
         <w:r>
@@ -1548,7 +1635,7 @@
           <w:sz w:val="24"/>
           <w:szCs w:val="24"/>
         </w:rPr>
-        <w:t>arbitrage</w:t>
+        <w:t>performance</w:t>
       </w:r>
       <w:r>
         <w:rPr>
@@ -1566,15 +1653,6 @@
           <w:sz w:val="24"/>
           <w:szCs w:val="24"/>
         </w:rPr>
-        <w:t xml:space="preserve">value </w:t>
-      </w:r>
-      <w:r>
-        <w:rPr>
-          <w:rFonts w:eastAsia="MS Mincho"/>
-          <w:b w:val="0"/>
-          <w:sz w:val="24"/>
-          <w:szCs w:val="24"/>
-        </w:rPr>
         <w:t>injection</w:t>
       </w:r>
       <w:r>
@@ -1629,7 +1707,7 @@
           <w:sz w:val="24"/>
           <w:szCs w:val="24"/>
         </w:rPr>
-        <w:t>with</w:t>
+        <w:t>through</w:t>
       </w:r>
       <w:r>
         <w:rPr>
@@ -1649,6 +1727,7 @@
         </w:rPr>
         <w:t xml:space="preserve">PWAs, </w:t>
       </w:r>
+      <w:proofErr w:type="spellStart"/>
       <w:r>
         <w:rPr>
           <w:rFonts w:eastAsia="MS Mincho"/>
@@ -1665,7 +1744,17 @@
           <w:sz w:val="24"/>
           <w:szCs w:val="24"/>
         </w:rPr>
-        <w:t xml:space="preserve">treamable </w:t>
+        <w:t>treamable</w:t>
+      </w:r>
+      <w:proofErr w:type="spellEnd"/>
+      <w:r>
+        <w:rPr>
+          <w:rFonts w:eastAsia="MS Mincho"/>
+          <w:b w:val="0"/>
+          <w:sz w:val="24"/>
+          <w:szCs w:val="24"/>
+        </w:rPr>
+        <w:t xml:space="preserve"> </w:t>
       </w:r>
       <w:r>
         <w:rPr>
@@ -1721,15 +1810,7 @@
         </w:rPr>
         <w:t xml:space="preserve"> </w:t>
       </w:r>
-      <w:r>
-        <w:rPr>
-          <w:rFonts w:eastAsia="MS Mincho"/>
-          <w:b w:val="0"/>
-          <w:sz w:val="24"/>
-          <w:szCs w:val="24"/>
-        </w:rPr>
-        <w:br/>
-      </w:r>
+      <w:proofErr w:type="spellStart"/>
       <w:r>
         <w:rPr>
           <w:rFonts w:eastAsia="MS Mincho"/>
@@ -1755,7 +1836,35 @@
           <w:sz w:val="24"/>
           <w:szCs w:val="24"/>
         </w:rPr>
-        <w:t>phQL API Gateway,</w:t>
+        <w:t>phQL</w:t>
+      </w:r>
+      <w:proofErr w:type="spellEnd"/>
+      <w:r>
+        <w:rPr>
+          <w:rFonts w:eastAsia="MS Mincho"/>
+          <w:b w:val="0"/>
+          <w:sz w:val="24"/>
+          <w:szCs w:val="24"/>
+        </w:rPr>
+        <w:t xml:space="preserve"> API Gateway</w:t>
+      </w:r>
+      <w:r>
+        <w:rPr>
+          <w:rFonts w:eastAsia="MS Mincho"/>
+          <w:b w:val="0"/>
+          <w:sz w:val="24"/>
+          <w:szCs w:val="24"/>
+        </w:rPr>
+        <w:t>s</w:t>
+      </w:r>
+      <w:r>
+        <w:rPr>
+          <w:rFonts w:eastAsia="MS Mincho"/>
+          <w:b w:val="0"/>
+          <w:sz w:val="24"/>
+          <w:szCs w:val="24"/>
+        </w:rPr>
+        <w:t>,</w:t>
       </w:r>
       <w:r>
         <w:rPr>
@@ -1773,6 +1882,15 @@
           <w:sz w:val="24"/>
           <w:szCs w:val="24"/>
         </w:rPr>
+        <w:t xml:space="preserve">and </w:t>
+      </w:r>
+      <w:r>
+        <w:rPr>
+          <w:rFonts w:eastAsia="MS Mincho"/>
+          <w:b w:val="0"/>
+          <w:sz w:val="24"/>
+          <w:szCs w:val="24"/>
+        </w:rPr>
         <w:t>M</w:t>
       </w:r>
       <w:r>
@@ -1782,33 +1900,6 @@
           <w:sz w:val="24"/>
           <w:szCs w:val="24"/>
         </w:rPr>
-        <w:t>icro-CMSs</w:t>
-      </w:r>
-      <w:r>
-        <w:rPr>
-          <w:rFonts w:eastAsia="MS Mincho"/>
-          <w:b w:val="0"/>
-          <w:sz w:val="24"/>
-          <w:szCs w:val="24"/>
-        </w:rPr>
-        <w:t xml:space="preserve">, and </w:t>
-      </w:r>
-      <w:r>
-        <w:rPr>
-          <w:rFonts w:eastAsia="MS Mincho"/>
-          <w:b w:val="0"/>
-          <w:sz w:val="24"/>
-          <w:szCs w:val="24"/>
-        </w:rPr>
-        <w:t>M</w:t>
-      </w:r>
-      <w:r>
-        <w:rPr>
-          <w:rFonts w:eastAsia="MS Mincho"/>
-          <w:b w:val="0"/>
-          <w:sz w:val="24"/>
-          <w:szCs w:val="24"/>
-        </w:rPr>
         <w:t>ulti-</w:t>
       </w:r>
       <w:r>
@@ -1854,25 +1945,16 @@
           <w:sz w:val="24"/>
           <w:szCs w:val="24"/>
         </w:rPr>
-        <w:t xml:space="preserve">ipeline </w:t>
-      </w:r>
-      <w:r>
-        <w:rPr>
-          <w:rFonts w:eastAsia="MS Mincho"/>
-          <w:b w:val="0"/>
-          <w:sz w:val="24"/>
-          <w:szCs w:val="24"/>
-        </w:rPr>
-        <w:t>D</w:t>
-      </w:r>
-      <w:r>
-        <w:rPr>
-          <w:rFonts w:eastAsia="MS Mincho"/>
-          <w:b w:val="0"/>
-          <w:sz w:val="24"/>
-          <w:szCs w:val="24"/>
-        </w:rPr>
-        <w:t>esign</w:t>
+        <w:t>ipeline</w:t>
+      </w:r>
+      <w:r>
+        <w:rPr>
+          <w:rFonts w:eastAsia="MS Mincho"/>
+          <w:b w:val="0"/>
+          <w:sz w:val="24"/>
+          <w:szCs w:val="24"/>
+        </w:rPr>
+        <w:t>s</w:t>
       </w:r>
       <w:r>
         <w:rPr>
@@ -1944,6 +2026,7 @@
           <w:szCs w:val="24"/>
         </w:rPr>
       </w:pPr>
+      <w:proofErr w:type="spellStart"/>
       <w:r>
         <w:rPr>
           <w:rFonts w:asciiTheme="majorHAnsi" w:eastAsia="MS Mincho" w:hAnsiTheme="majorHAnsi"/>
@@ -1958,8 +2041,17 @@
           <w:sz w:val="24"/>
           <w:szCs w:val="24"/>
         </w:rPr>
-        <w:t>onsert</w:t>
-      </w:r>
+        <w:t>onser</w:t>
+      </w:r>
+      <w:r>
+        <w:rPr>
+          <w:rFonts w:asciiTheme="majorHAnsi" w:eastAsia="MS Mincho" w:hAnsiTheme="majorHAnsi"/>
+          <w:sz w:val="24"/>
+          <w:szCs w:val="24"/>
+        </w:rPr>
+        <w:t>t</w:t>
+      </w:r>
+      <w:proofErr w:type="spellEnd"/>
       <w:r>
         <w:rPr>
           <w:rFonts w:asciiTheme="majorHAnsi" w:eastAsia="MS Mincho" w:hAnsiTheme="majorHAnsi"/>
@@ -2031,7 +2123,6 @@
           <w:szCs w:val="24"/>
         </w:rPr>
         <w:tab/>
-        <w:t>Aug’16-Oct’17</w:t>
       </w:r>
       <w:r>
         <w:rPr>
@@ -2040,6 +2131,38 @@
           <w:szCs w:val="24"/>
         </w:rPr>
         <w:tab/>
+      </w:r>
+      <w:r>
+        <w:rPr>
+          <w:rFonts w:asciiTheme="majorHAnsi" w:eastAsia="MS Mincho" w:hAnsiTheme="majorHAnsi"/>
+          <w:sz w:val="24"/>
+          <w:szCs w:val="24"/>
+        </w:rPr>
+        <w:tab/>
+      </w:r>
+      <w:r>
+        <w:rPr>
+          <w:rFonts w:asciiTheme="majorHAnsi" w:eastAsia="MS Mincho" w:hAnsiTheme="majorHAnsi"/>
+          <w:sz w:val="24"/>
+          <w:szCs w:val="24"/>
+        </w:rPr>
+        <w:t xml:space="preserve">1y </w:t>
+      </w:r>
+      <w:r>
+        <w:rPr>
+          <w:rFonts w:asciiTheme="majorHAnsi" w:eastAsia="MS Mincho" w:hAnsiTheme="majorHAnsi"/>
+          <w:sz w:val="24"/>
+          <w:szCs w:val="24"/>
+        </w:rPr>
+        <w:t>5</w:t>
+      </w:r>
+      <w:r>
+        <w:rPr>
+          <w:rFonts w:asciiTheme="majorHAnsi" w:eastAsia="MS Mincho" w:hAnsiTheme="majorHAnsi"/>
+          <w:sz w:val="24"/>
+          <w:szCs w:val="24"/>
+        </w:rPr>
+        <w:t>m</w:t>
       </w:r>
     </w:p>
     <w:p>
@@ -2336,6 +2459,7 @@
         </w:rPr>
         <w:t xml:space="preserve">pollo, </w:t>
       </w:r>
+      <w:proofErr w:type="spellStart"/>
       <w:r>
         <w:rPr>
           <w:rFonts w:eastAsia="MS Mincho" w:cs="Calibri"/>
@@ -2370,8 +2494,9 @@
           <w:sz w:val="24"/>
           <w:szCs w:val="24"/>
         </w:rPr>
-        <w:t xml:space="preserve">ack, </w:t>
-      </w:r>
+        <w:t>ack</w:t>
+      </w:r>
+      <w:proofErr w:type="spellEnd"/>
       <w:r>
         <w:rPr>
           <w:rFonts w:eastAsia="MS Mincho" w:cs="Calibri"/>
@@ -2379,6 +2504,16 @@
           <w:sz w:val="24"/>
           <w:szCs w:val="24"/>
         </w:rPr>
+        <w:t xml:space="preserve">, </w:t>
+      </w:r>
+      <w:proofErr w:type="spellStart"/>
+      <w:r>
+        <w:rPr>
+          <w:rFonts w:eastAsia="MS Mincho" w:cs="Calibri"/>
+          <w:b w:val="0"/>
+          <w:sz w:val="24"/>
+          <w:szCs w:val="24"/>
+        </w:rPr>
         <w:t>R</w:t>
       </w:r>
       <w:r>
@@ -2399,6 +2534,7 @@
         </w:rPr>
         <w:t>JS</w:t>
       </w:r>
+      <w:proofErr w:type="spellEnd"/>
       <w:r>
         <w:rPr>
           <w:rFonts w:eastAsia="MS Mincho" w:cs="Calibri"/>
@@ -2408,6 +2544,7 @@
         </w:rPr>
         <w:t xml:space="preserve">, </w:t>
       </w:r>
+      <w:proofErr w:type="spellStart"/>
       <w:r>
         <w:rPr>
           <w:rFonts w:eastAsia="MS Mincho" w:cs="Calibri"/>
@@ -2426,6 +2563,7 @@
         </w:rPr>
         <w:t>odash</w:t>
       </w:r>
+      <w:proofErr w:type="spellEnd"/>
       <w:r>
         <w:rPr>
           <w:rFonts w:eastAsia="MS Mincho" w:cs="Calibri"/>
@@ -2453,6 +2591,7 @@
         </w:rPr>
         <w:t xml:space="preserve">MongoDB, </w:t>
       </w:r>
+      <w:proofErr w:type="spellStart"/>
       <w:r>
         <w:rPr>
           <w:rFonts w:eastAsia="MS Mincho" w:cs="Calibri"/>
@@ -2462,6 +2601,7 @@
         </w:rPr>
         <w:t>Recombee</w:t>
       </w:r>
+      <w:proofErr w:type="spellEnd"/>
       <w:r>
         <w:rPr>
           <w:rFonts w:eastAsia="MS Mincho" w:cs="Calibri"/>
@@ -2624,8 +2764,6 @@
         </w:rPr>
         <w:t>elevant</w:t>
       </w:r>
-      <w:bookmarkStart w:id="0" w:name="_GoBack"/>
-      <w:bookmarkEnd w:id="0"/>
       <w:r>
         <w:rPr>
           <w:rFonts w:eastAsia="MS Mincho" w:cs="Calibri"/>
@@ -2707,7 +2845,7 @@
         </w:rPr>
         <w:t xml:space="preserve">edux, </w:t>
       </w:r>
-      <w:bookmarkStart w:id="1" w:name="_Hlk17066952"/>
+      <w:bookmarkStart w:id="0" w:name="_Hlk17066952"/>
       <w:r>
         <w:rPr>
           <w:rFonts w:eastAsia="MS Mincho" w:cs="Calibri"/>
@@ -2725,14 +2863,6 @@
           <w:szCs w:val="24"/>
         </w:rPr>
         <w:instrText xml:space="preserve"> HYPERLINK "https://github.com/prateekrastogi/feathers-authentication" </w:instrText>
-      </w:r>
-      <w:r>
-        <w:rPr>
-          <w:rFonts w:eastAsia="MS Mincho" w:cs="Calibri"/>
-          <w:b w:val="0"/>
-          <w:sz w:val="24"/>
-          <w:szCs w:val="24"/>
-        </w:rPr>
       </w:r>
       <w:r>
         <w:rPr>
@@ -2753,7 +2883,7 @@
         </w:rPr>
         <w:t>Feathers</w:t>
       </w:r>
-      <w:bookmarkEnd w:id="1"/>
+      <w:bookmarkEnd w:id="0"/>
       <w:r>
         <w:rPr>
           <w:rFonts w:eastAsia="MS Mincho" w:cs="Calibri"/>
@@ -2875,6 +3005,8 @@
           <w:t>https://github.com/prateekrastogi/bakendi</w:t>
         </w:r>
       </w:hyperlink>
+      <w:bookmarkStart w:id="1" w:name="_GoBack"/>
+      <w:bookmarkEnd w:id="1"/>
     </w:p>
     <w:p>
       <w:pPr>
@@ -2906,7 +3038,15 @@
           <w:sz w:val="24"/>
           <w:szCs w:val="24"/>
         </w:rPr>
-        <w:t>FICO</w:t>
+        <w:t>FIC</w:t>
+      </w:r>
+      <w:r>
+        <w:rPr>
+          <w:rFonts w:asciiTheme="majorHAnsi" w:eastAsia="MS Mincho" w:hAnsiTheme="majorHAnsi"/>
+          <w:sz w:val="24"/>
+          <w:szCs w:val="24"/>
+        </w:rPr>
+        <w:t xml:space="preserve">O   </w:t>
       </w:r>
       <w:r>
         <w:rPr>
@@ -2979,7 +3119,31 @@
           <w:szCs w:val="24"/>
         </w:rPr>
         <w:tab/>
-        <w:t>Jun’14-Jul’16</w:t>
+      </w:r>
+      <w:r>
+        <w:rPr>
+          <w:rFonts w:asciiTheme="majorHAnsi" w:eastAsia="MS Mincho" w:hAnsiTheme="majorHAnsi"/>
+          <w:sz w:val="24"/>
+          <w:szCs w:val="24"/>
+        </w:rPr>
+        <w:tab/>
+      </w:r>
+      <w:r>
+        <w:rPr>
+          <w:rFonts w:asciiTheme="majorHAnsi" w:eastAsia="MS Mincho" w:hAnsiTheme="majorHAnsi"/>
+          <w:sz w:val="24"/>
+          <w:szCs w:val="24"/>
+        </w:rPr>
+        <w:tab/>
+        <w:t>2</w:t>
+      </w:r>
+      <w:r>
+        <w:rPr>
+          <w:rFonts w:asciiTheme="majorHAnsi" w:eastAsia="MS Mincho" w:hAnsiTheme="majorHAnsi"/>
+          <w:sz w:val="24"/>
+          <w:szCs w:val="24"/>
+        </w:rPr>
+        <w:t>y 2m</w:t>
       </w:r>
     </w:p>
     <w:p>
@@ -3474,6 +3638,7 @@
           <w:szCs w:val="24"/>
         </w:rPr>
       </w:pPr>
+      <w:proofErr w:type="gramStart"/>
       <w:r>
         <w:rPr>
           <w:rFonts w:asciiTheme="majorHAnsi" w:eastAsia="MS Mincho" w:hAnsiTheme="majorHAnsi"/>
@@ -3488,8 +3653,17 @@
           <w:sz w:val="24"/>
           <w:szCs w:val="24"/>
         </w:rPr>
+        <w:t xml:space="preserve">  </w:t>
+      </w:r>
+      <w:r>
+        <w:rPr>
+          <w:rFonts w:asciiTheme="majorHAnsi" w:eastAsia="MS Mincho" w:hAnsiTheme="majorHAnsi"/>
+          <w:sz w:val="24"/>
+          <w:szCs w:val="24"/>
+        </w:rPr>
         <w:tab/>
       </w:r>
+      <w:proofErr w:type="gramEnd"/>
       <w:r>
         <w:rPr>
           <w:rFonts w:asciiTheme="majorHAnsi" w:eastAsia="MS Mincho" w:hAnsiTheme="majorHAnsi"/>
@@ -3560,7 +3734,24 @@
           <w:sz w:val="24"/>
           <w:szCs w:val="24"/>
         </w:rPr>
-        <w:t>May’13-Jul’13</w:t>
+        <w:tab/>
+      </w:r>
+      <w:r>
+        <w:rPr>
+          <w:rFonts w:asciiTheme="majorHAnsi" w:eastAsia="MS Mincho" w:hAnsiTheme="majorHAnsi"/>
+          <w:sz w:val="24"/>
+          <w:szCs w:val="24"/>
+        </w:rPr>
+        <w:tab/>
+        <w:t xml:space="preserve">      </w:t>
+      </w:r>
+      <w:r>
+        <w:rPr>
+          <w:rFonts w:asciiTheme="majorHAnsi" w:eastAsia="MS Mincho" w:hAnsiTheme="majorHAnsi"/>
+          <w:sz w:val="24"/>
+          <w:szCs w:val="24"/>
+        </w:rPr>
+        <w:t>3m</w:t>
       </w:r>
     </w:p>
     <w:p>
@@ -3751,11 +3942,9 @@
         <w:pStyle w:val="JobTitlebold"/>
         <w:ind w:left="1080"/>
         <w:rPr>
-          <w:rFonts w:eastAsia="MS Mincho"/>
-          <w:b w:val="0"/>
-          <w:sz w:val="24"/>
-          <w:szCs w:val="24"/>
-          <w:u w:val="single"/>
+          <w:rFonts w:asciiTheme="minorHAnsi" w:eastAsia="MS Mincho" w:hAnsiTheme="minorHAnsi"/>
+          <w:sz w:val="24"/>
+          <w:szCs w:val="24"/>
         </w:rPr>
       </w:pPr>
       <w:hyperlink r:id="rId18" w:history="1">
@@ -3770,38 +3959,213 @@
           <w:t>https://github.com/prateekrastogi/Evolution-of-R</w:t>
         </w:r>
       </w:hyperlink>
+      <w:r>
+        <w:rPr>
+          <w:rFonts w:asciiTheme="minorHAnsi" w:eastAsia="MS Mincho" w:hAnsiTheme="minorHAnsi"/>
+          <w:b w:val="0"/>
+          <w:sz w:val="24"/>
+          <w:szCs w:val="24"/>
+        </w:rPr>
+        <w:tab/>
+      </w:r>
+      <w:r>
+        <w:rPr>
+          <w:rFonts w:asciiTheme="minorHAnsi" w:eastAsia="MS Mincho" w:hAnsiTheme="minorHAnsi"/>
+          <w:b w:val="0"/>
+          <w:sz w:val="24"/>
+          <w:szCs w:val="24"/>
+        </w:rPr>
+        <w:tab/>
+      </w:r>
+      <w:r>
+        <w:rPr>
+          <w:rFonts w:asciiTheme="minorHAnsi" w:eastAsia="MS Mincho" w:hAnsiTheme="minorHAnsi"/>
+          <w:b w:val="0"/>
+          <w:sz w:val="24"/>
+          <w:szCs w:val="24"/>
+        </w:rPr>
+        <w:tab/>
+      </w:r>
     </w:p>
     <w:p>
       <w:pPr>
-        <w:pStyle w:val="JobTitlebold"/>
-        <w:rPr>
-          <w:rFonts w:asciiTheme="minorHAnsi" w:eastAsia="MS Mincho" w:hAnsiTheme="minorHAnsi"/>
-          <w:sz w:val="24"/>
-          <w:szCs w:val="24"/>
-        </w:rPr>
-      </w:pPr>
-      <w:r>
-        <w:rPr>
-          <w:rFonts w:asciiTheme="minorHAnsi" w:eastAsia="MS Mincho" w:hAnsiTheme="minorHAnsi"/>
-          <w:b w:val="0"/>
-          <w:sz w:val="24"/>
-          <w:szCs w:val="24"/>
-        </w:rPr>
-        <w:tab/>
-      </w:r>
-      <w:r>
-        <w:rPr>
-          <w:rFonts w:asciiTheme="minorHAnsi" w:eastAsia="MS Mincho" w:hAnsiTheme="minorHAnsi"/>
-          <w:b w:val="0"/>
-          <w:sz w:val="24"/>
-          <w:szCs w:val="24"/>
-        </w:rPr>
-        <w:tab/>
-      </w:r>
-      <w:r>
-        <w:rPr>
-          <w:rFonts w:asciiTheme="minorHAnsi" w:eastAsia="MS Mincho" w:hAnsiTheme="minorHAnsi"/>
-          <w:b w:val="0"/>
+        <w:pStyle w:val="ResumeHeadings"/>
+        <w:rPr>
+          <w:b w:val="0"/>
+          <w:sz w:val="32"/>
+          <w:szCs w:val="32"/>
+        </w:rPr>
+      </w:pPr>
+      <w:r>
+        <w:rPr>
+          <w:rFonts w:asciiTheme="majorHAnsi" w:hAnsiTheme="majorHAnsi"/>
+          <w:sz w:val="32"/>
+          <w:szCs w:val="32"/>
+        </w:rPr>
+        <w:lastRenderedPageBreak/>
+        <w:t>Education</w:t>
+      </w:r>
+    </w:p>
+    <w:p>
+      <w:pPr>
+        <w:pStyle w:val="BulletPoints"/>
+        <w:numPr>
+          <w:ilvl w:val="0"/>
+          <w:numId w:val="0"/>
+        </w:numPr>
+        <w:ind w:left="360"/>
+      </w:pPr>
+    </w:p>
+    <w:p>
+      <w:pPr>
+        <w:pStyle w:val="BulletPoints"/>
+        <w:numPr>
+          <w:ilvl w:val="0"/>
+          <w:numId w:val="30"/>
+        </w:numPr>
+        <w:rPr>
+          <w:sz w:val="24"/>
+          <w:szCs w:val="24"/>
+        </w:rPr>
+      </w:pPr>
+      <w:r>
+        <w:rPr>
+          <w:sz w:val="24"/>
+          <w:szCs w:val="24"/>
+        </w:rPr>
+        <w:t xml:space="preserve">Conferred </w:t>
+      </w:r>
+      <w:r>
+        <w:rPr>
+          <w:sz w:val="24"/>
+          <w:szCs w:val="24"/>
+        </w:rPr>
+        <w:t>Bachelor of Technology in Compu</w:t>
+      </w:r>
+      <w:r>
+        <w:rPr>
+          <w:sz w:val="24"/>
+          <w:szCs w:val="24"/>
+        </w:rPr>
+        <w:t xml:space="preserve">ter Science and Engineering </w:t>
+      </w:r>
+      <w:r>
+        <w:rPr>
+          <w:sz w:val="24"/>
+          <w:szCs w:val="24"/>
+        </w:rPr>
+        <w:t>by</w:t>
+      </w:r>
+      <w:r>
+        <w:rPr>
+          <w:sz w:val="24"/>
+          <w:szCs w:val="24"/>
+        </w:rPr>
+        <w:t xml:space="preserve"> IIT Guwahati </w:t>
+      </w:r>
+    </w:p>
+    <w:p>
+      <w:pPr>
+        <w:pStyle w:val="BulletPoints"/>
+        <w:numPr>
+          <w:ilvl w:val="0"/>
+          <w:numId w:val="0"/>
+        </w:numPr>
+        <w:ind w:left="1080"/>
+        <w:rPr>
+          <w:sz w:val="24"/>
+          <w:szCs w:val="24"/>
+        </w:rPr>
+      </w:pPr>
+      <w:r>
+        <w:rPr>
+          <w:sz w:val="24"/>
+          <w:szCs w:val="24"/>
+        </w:rPr>
+        <w:t>(</w:t>
+      </w:r>
+      <w:r>
+        <w:rPr>
+          <w:sz w:val="24"/>
+          <w:szCs w:val="24"/>
+        </w:rPr>
+        <w:t>Indian Institute of Technology Guwahati)</w:t>
+      </w:r>
+      <w:r>
+        <w:rPr>
+          <w:sz w:val="24"/>
+          <w:szCs w:val="24"/>
+        </w:rPr>
+        <w:t>.</w:t>
+      </w:r>
+    </w:p>
+    <w:p>
+      <w:pPr>
+        <w:pStyle w:val="BulletPoints"/>
+        <w:numPr>
+          <w:ilvl w:val="0"/>
+          <w:numId w:val="0"/>
+        </w:numPr>
+        <w:tabs>
+          <w:tab w:val="center" w:pos="5670"/>
+        </w:tabs>
+        <w:ind w:left="720" w:firstLine="360"/>
+        <w:rPr>
+          <w:rFonts w:asciiTheme="majorHAnsi" w:hAnsiTheme="majorHAnsi"/>
+          <w:b/>
+          <w:sz w:val="24"/>
+          <w:szCs w:val="24"/>
+        </w:rPr>
+      </w:pPr>
+      <w:r>
+        <w:rPr>
+          <w:rFonts w:asciiTheme="majorHAnsi" w:hAnsiTheme="majorHAnsi"/>
+          <w:b/>
+          <w:sz w:val="24"/>
+          <w:szCs w:val="24"/>
+        </w:rPr>
+        <w:t>2010</w:t>
+      </w:r>
+      <w:r>
+        <w:rPr>
+          <w:rFonts w:asciiTheme="majorHAnsi" w:hAnsiTheme="majorHAnsi"/>
+          <w:b/>
+          <w:sz w:val="24"/>
+          <w:szCs w:val="24"/>
+        </w:rPr>
+        <w:t xml:space="preserve"> </w:t>
+      </w:r>
+      <w:r>
+        <w:rPr>
+          <w:rFonts w:asciiTheme="majorHAnsi" w:hAnsiTheme="majorHAnsi"/>
+          <w:b/>
+          <w:sz w:val="24"/>
+          <w:szCs w:val="24"/>
+        </w:rPr>
+        <w:t>–</w:t>
+      </w:r>
+      <w:r>
+        <w:rPr>
+          <w:rFonts w:asciiTheme="majorHAnsi" w:hAnsiTheme="majorHAnsi"/>
+          <w:b/>
+          <w:sz w:val="24"/>
+          <w:szCs w:val="24"/>
+        </w:rPr>
+        <w:t xml:space="preserve"> </w:t>
+      </w:r>
+      <w:r>
+        <w:rPr>
+          <w:rFonts w:asciiTheme="majorHAnsi" w:hAnsiTheme="majorHAnsi"/>
+          <w:b/>
+          <w:sz w:val="24"/>
+          <w:szCs w:val="24"/>
+        </w:rPr>
+        <w:t>2014</w:t>
+      </w:r>
+      <w:r>
+        <w:rPr>
+          <w:rFonts w:asciiTheme="majorHAnsi" w:hAnsiTheme="majorHAnsi"/>
+          <w:b/>
           <w:sz w:val="24"/>
           <w:szCs w:val="24"/>
         </w:rPr>
@@ -3826,11 +4190,10 @@
           <w:szCs w:val="32"/>
           <w:lang w:val="en-IN" w:eastAsia="en-IN"/>
         </w:rPr>
-        <w:lastRenderedPageBreak/>
         <mc:AlternateContent>
           <mc:Choice Requires="wps">
             <w:drawing>
-              <wp:anchor distT="0" distB="0" distL="114300" distR="114300" simplePos="0" relativeHeight="251707392" behindDoc="0" locked="0" layoutInCell="1" allowOverlap="1" wp14:anchorId="7FA011E5" wp14:editId="6FBB0CC1">
+              <wp:anchor distT="0" distB="0" distL="114300" distR="114300" simplePos="0" relativeHeight="251707392" behindDoc="0" locked="0" layoutInCell="1" allowOverlap="1" wp14:anchorId="7FA011E5" wp14:editId="53AE63E4">
                 <wp:simplePos x="0" y="0"/>
                 <wp:positionH relativeFrom="margin">
                   <wp:align>left</wp:align>
@@ -3894,7 +4257,7 @@
           </mc:Choice>
           <mc:Fallback>
             <w:pict>
-              <v:line w14:anchorId="35C6F417" id="Line 2" o:spid="_x0000_s1026" style="position:absolute;flip:x;z-index:251707392;visibility:visible;mso-wrap-style:square;mso-width-percent:0;mso-height-percent:0;mso-wrap-distance-left:9pt;mso-wrap-distance-top:0;mso-wrap-distance-right:9pt;mso-wrap-distance-bottom:0;mso-position-horizontal:left;mso-position-horizontal-relative:margin;mso-position-vertical:center;mso-position-vertical-relative:margin;mso-width-percent:0;mso-height-percent:0;mso-width-relative:page;mso-height-relative:page" from="0,0" to="0,698.4pt" o:gfxdata="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" strokecolor="#2f5897 [3215]" strokeweight="5.25pt">
+              <v:line w14:anchorId="7125444A" id="Line 2" o:spid="_x0000_s1026" style="position:absolute;flip:x;z-index:251707392;visibility:visible;mso-wrap-style:square;mso-width-percent:0;mso-height-percent:0;mso-wrap-distance-left:9pt;mso-wrap-distance-top:0;mso-wrap-distance-right:9pt;mso-wrap-distance-bottom:0;mso-position-horizontal:left;mso-position-horizontal-relative:margin;mso-position-vertical:center;mso-position-vertical-relative:margin;mso-width-percent:0;mso-height-percent:0;mso-width-relative:page;mso-height-relative:page" from="0,0" to="0,698.4pt" o:gfxdata="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" strokecolor="#2f5897 [3215]" strokeweight="5.25pt">
                 <w10:wrap anchorx="margin" anchory="margin"/>
               </v:line>
             </w:pict>
@@ -4289,6 +4652,7 @@
           <w:szCs w:val="24"/>
         </w:rPr>
       </w:pPr>
+      <w:proofErr w:type="spellStart"/>
       <w:r>
         <w:rPr>
           <w:rFonts w:eastAsia="MS Mincho"/>
@@ -4314,7 +4678,17 @@
           <w:sz w:val="24"/>
           <w:szCs w:val="24"/>
         </w:rPr>
-        <w:t xml:space="preserve">ack, </w:t>
+        <w:t>ack</w:t>
+      </w:r>
+      <w:proofErr w:type="spellEnd"/>
+      <w:r>
+        <w:rPr>
+          <w:rFonts w:eastAsia="MS Mincho"/>
+          <w:b w:val="0"/>
+          <w:sz w:val="24"/>
+          <w:szCs w:val="24"/>
+        </w:rPr>
+        <w:t xml:space="preserve">, </w:t>
       </w:r>
       <w:r>
         <w:rPr>
@@ -4393,6 +4767,7 @@
           <w:szCs w:val="24"/>
         </w:rPr>
       </w:pPr>
+      <w:proofErr w:type="spellStart"/>
       <w:r>
         <w:rPr>
           <w:rFonts w:eastAsia="MS Mincho"/>
@@ -4411,6 +4786,7 @@
         </w:rPr>
         <w:t>JS</w:t>
       </w:r>
+      <w:proofErr w:type="spellEnd"/>
       <w:r>
         <w:rPr>
           <w:rFonts w:eastAsia="MS Mincho"/>
@@ -4427,8 +4803,29 @@
           <w:sz w:val="24"/>
           <w:szCs w:val="24"/>
         </w:rPr>
-        <w:t xml:space="preserve"> Ramda, </w:t>
-      </w:r>
+        <w:t xml:space="preserve"> </w:t>
+      </w:r>
+      <w:proofErr w:type="spellStart"/>
+      <w:r>
+        <w:rPr>
+          <w:rFonts w:eastAsia="MS Mincho"/>
+          <w:b w:val="0"/>
+          <w:sz w:val="24"/>
+          <w:szCs w:val="24"/>
+        </w:rPr>
+        <w:t>Ramda</w:t>
+      </w:r>
+      <w:proofErr w:type="spellEnd"/>
+      <w:r>
+        <w:rPr>
+          <w:rFonts w:eastAsia="MS Mincho"/>
+          <w:b w:val="0"/>
+          <w:sz w:val="24"/>
+          <w:szCs w:val="24"/>
+        </w:rPr>
+        <w:t xml:space="preserve">, </w:t>
+      </w:r>
+      <w:proofErr w:type="spellStart"/>
       <w:r>
         <w:rPr>
           <w:rFonts w:eastAsia="MS Mincho"/>
@@ -4447,6 +4844,7 @@
         </w:rPr>
         <w:t>odash</w:t>
       </w:r>
+      <w:proofErr w:type="spellEnd"/>
       <w:r>
         <w:rPr>
           <w:rFonts w:eastAsia="MS Mincho"/>
@@ -4474,6 +4872,7 @@
         </w:rPr>
         <w:t xml:space="preserve">, </w:t>
       </w:r>
+      <w:proofErr w:type="spellStart"/>
       <w:r>
         <w:rPr>
           <w:rFonts w:eastAsia="MS Mincho"/>
@@ -4501,15 +4900,27 @@
         </w:rPr>
         <w:t>JS</w:t>
       </w:r>
-      <w:r>
-        <w:rPr>
-          <w:rFonts w:eastAsia="MS Mincho"/>
-          <w:b w:val="0"/>
-          <w:sz w:val="24"/>
-          <w:szCs w:val="24"/>
-        </w:rPr>
-        <w:t>, TSLint</w:t>
-      </w:r>
+      <w:proofErr w:type="spellEnd"/>
+      <w:r>
+        <w:rPr>
+          <w:rFonts w:eastAsia="MS Mincho"/>
+          <w:b w:val="0"/>
+          <w:sz w:val="24"/>
+          <w:szCs w:val="24"/>
+        </w:rPr>
+        <w:t xml:space="preserve">, </w:t>
+      </w:r>
+      <w:proofErr w:type="spellStart"/>
+      <w:r>
+        <w:rPr>
+          <w:rFonts w:eastAsia="MS Mincho"/>
+          <w:b w:val="0"/>
+          <w:sz w:val="24"/>
+          <w:szCs w:val="24"/>
+        </w:rPr>
+        <w:t>TSLint</w:t>
+      </w:r>
+      <w:proofErr w:type="spellEnd"/>
       <w:r>
         <w:rPr>
           <w:rFonts w:eastAsia="MS Mincho"/>
@@ -4680,7 +5091,27 @@
           <w:sz w:val="24"/>
           <w:szCs w:val="24"/>
         </w:rPr>
-        <w:t>ebpack, Babel, Gulp, and npm.</w:t>
+        <w:t xml:space="preserve">ebpack, Babel, Gulp, and </w:t>
+      </w:r>
+      <w:proofErr w:type="spellStart"/>
+      <w:r>
+        <w:rPr>
+          <w:rFonts w:eastAsia="MS Mincho"/>
+          <w:b w:val="0"/>
+          <w:sz w:val="24"/>
+          <w:szCs w:val="24"/>
+        </w:rPr>
+        <w:t>npm</w:t>
+      </w:r>
+      <w:proofErr w:type="spellEnd"/>
+      <w:r>
+        <w:rPr>
+          <w:rFonts w:eastAsia="MS Mincho"/>
+          <w:b w:val="0"/>
+          <w:sz w:val="24"/>
+          <w:szCs w:val="24"/>
+        </w:rPr>
+        <w:t>.</w:t>
       </w:r>
     </w:p>
     <w:p>
@@ -4827,6 +5258,7 @@
         </w:rPr>
         <w:t xml:space="preserve">, </w:t>
       </w:r>
+      <w:proofErr w:type="spellStart"/>
       <w:r>
         <w:rPr>
           <w:rFonts w:eastAsia="MS Mincho"/>
@@ -4845,6 +5277,7 @@
         </w:rPr>
         <w:t>DB</w:t>
       </w:r>
+      <w:proofErr w:type="spellEnd"/>
       <w:r>
         <w:rPr>
           <w:rFonts w:eastAsia="MS Mincho"/>
@@ -4948,7 +5381,47 @@
           <w:sz w:val="24"/>
           <w:szCs w:val="24"/>
         </w:rPr>
-        <w:t>Helm, Knative, Kubernetes, Istio, Docker Compose, Docker, and Vagrant.</w:t>
+        <w:t xml:space="preserve">Helm, </w:t>
+      </w:r>
+      <w:proofErr w:type="spellStart"/>
+      <w:r>
+        <w:rPr>
+          <w:rFonts w:eastAsia="MS Mincho"/>
+          <w:b w:val="0"/>
+          <w:sz w:val="24"/>
+          <w:szCs w:val="24"/>
+        </w:rPr>
+        <w:t>Knative</w:t>
+      </w:r>
+      <w:proofErr w:type="spellEnd"/>
+      <w:r>
+        <w:rPr>
+          <w:rFonts w:eastAsia="MS Mincho"/>
+          <w:b w:val="0"/>
+          <w:sz w:val="24"/>
+          <w:szCs w:val="24"/>
+        </w:rPr>
+        <w:t xml:space="preserve">, Kubernetes, </w:t>
+      </w:r>
+      <w:proofErr w:type="spellStart"/>
+      <w:r>
+        <w:rPr>
+          <w:rFonts w:eastAsia="MS Mincho"/>
+          <w:b w:val="0"/>
+          <w:sz w:val="24"/>
+          <w:szCs w:val="24"/>
+        </w:rPr>
+        <w:t>Istio</w:t>
+      </w:r>
+      <w:proofErr w:type="spellEnd"/>
+      <w:r>
+        <w:rPr>
+          <w:rFonts w:eastAsia="MS Mincho"/>
+          <w:b w:val="0"/>
+          <w:sz w:val="24"/>
+          <w:szCs w:val="24"/>
+        </w:rPr>
+        <w:t>, Docker Compose, Docker, and Vagrant.</w:t>
       </w:r>
     </w:p>
     <w:p>
@@ -5176,7 +5649,27 @@
           <w:sz w:val="24"/>
           <w:szCs w:val="24"/>
         </w:rPr>
-        <w:t xml:space="preserve"> Chrome DevTools, </w:t>
+        <w:t xml:space="preserve"> Chrome </w:t>
+      </w:r>
+      <w:proofErr w:type="spellStart"/>
+      <w:r>
+        <w:rPr>
+          <w:rFonts w:eastAsia="MS Mincho"/>
+          <w:b w:val="0"/>
+          <w:sz w:val="24"/>
+          <w:szCs w:val="24"/>
+        </w:rPr>
+        <w:t>DevTools</w:t>
+      </w:r>
+      <w:proofErr w:type="spellEnd"/>
+      <w:r>
+        <w:rPr>
+          <w:rFonts w:eastAsia="MS Mincho"/>
+          <w:b w:val="0"/>
+          <w:sz w:val="24"/>
+          <w:szCs w:val="24"/>
+        </w:rPr>
+        <w:t xml:space="preserve">, </w:t>
       </w:r>
       <w:r>
         <w:rPr>
@@ -5311,7 +5804,17 @@
           <w:sz w:val="24"/>
           <w:szCs w:val="24"/>
         </w:rPr>
-        <w:t xml:space="preserve"> Visual Studio, and Code</w:t>
+        <w:t xml:space="preserve"> Visual Studio, and </w:t>
+      </w:r>
+      <w:proofErr w:type="gramStart"/>
+      <w:r>
+        <w:rPr>
+          <w:rFonts w:eastAsia="MS Mincho"/>
+          <w:b w:val="0"/>
+          <w:sz w:val="24"/>
+          <w:szCs w:val="24"/>
+        </w:rPr>
+        <w:t>Code</w:t>
       </w:r>
       <w:r>
         <w:rPr>
@@ -5322,6 +5825,7 @@
         </w:rPr>
         <w:t>::</w:t>
       </w:r>
+      <w:proofErr w:type="gramEnd"/>
       <w:r>
         <w:rPr>
           <w:rFonts w:eastAsia="MS Mincho"/>
@@ -5330,243 +5834,6 @@
           <w:szCs w:val="24"/>
         </w:rPr>
         <w:t>Blocks.</w:t>
-      </w:r>
-    </w:p>
-    <w:p>
-      <w:pPr>
-        <w:pStyle w:val="ResumeHeadings"/>
-        <w:rPr>
-          <w:b w:val="0"/>
-          <w:sz w:val="32"/>
-          <w:szCs w:val="32"/>
-        </w:rPr>
-      </w:pPr>
-      <w:r>
-        <w:rPr>
-          <w:rFonts w:asciiTheme="majorHAnsi" w:hAnsiTheme="majorHAnsi"/>
-          <w:sz w:val="32"/>
-          <w:szCs w:val="32"/>
-        </w:rPr>
-        <w:t>Education</w:t>
-      </w:r>
-    </w:p>
-    <w:p>
-      <w:pPr>
-        <w:pStyle w:val="BulletPoints"/>
-        <w:numPr>
-          <w:ilvl w:val="0"/>
-          <w:numId w:val="0"/>
-        </w:numPr>
-        <w:ind w:left="360"/>
-      </w:pPr>
-    </w:p>
-    <w:p>
-      <w:pPr>
-        <w:pStyle w:val="BulletPoints"/>
-        <w:numPr>
-          <w:ilvl w:val="0"/>
-          <w:numId w:val="30"/>
-        </w:numPr>
-        <w:rPr>
-          <w:sz w:val="24"/>
-          <w:szCs w:val="24"/>
-        </w:rPr>
-      </w:pPr>
-      <w:r>
-        <w:rPr>
-          <w:sz w:val="24"/>
-          <w:szCs w:val="24"/>
-        </w:rPr>
-        <w:t>C</w:t>
-      </w:r>
-      <w:r>
-        <w:rPr>
-          <w:sz w:val="24"/>
-          <w:szCs w:val="24"/>
-        </w:rPr>
-        <w:t>onferred</w:t>
-      </w:r>
-      <w:r>
-        <w:rPr>
-          <w:sz w:val="24"/>
-          <w:szCs w:val="24"/>
-        </w:rPr>
-        <w:t xml:space="preserve"> </w:t>
-      </w:r>
-      <w:r>
-        <w:rPr>
-          <w:sz w:val="24"/>
-          <w:szCs w:val="24"/>
-        </w:rPr>
-        <w:t xml:space="preserve">Bachelor of </w:t>
-      </w:r>
-      <w:r>
-        <w:rPr>
-          <w:sz w:val="24"/>
-          <w:szCs w:val="24"/>
-        </w:rPr>
-        <w:t>Tech</w:t>
-      </w:r>
-      <w:r>
-        <w:rPr>
-          <w:sz w:val="24"/>
-          <w:szCs w:val="24"/>
-        </w:rPr>
-        <w:t>nology</w:t>
-      </w:r>
-      <w:r>
-        <w:rPr>
-          <w:sz w:val="24"/>
-          <w:szCs w:val="24"/>
-        </w:rPr>
-        <w:t xml:space="preserve"> in Compu</w:t>
-      </w:r>
-      <w:r>
-        <w:rPr>
-          <w:sz w:val="24"/>
-          <w:szCs w:val="24"/>
-        </w:rPr>
-        <w:t>ter Science and Engineering by</w:t>
-      </w:r>
-      <w:r>
-        <w:rPr>
-          <w:sz w:val="24"/>
-          <w:szCs w:val="24"/>
-        </w:rPr>
-        <w:t xml:space="preserve"> </w:t>
-      </w:r>
-      <w:r>
-        <w:rPr>
-          <w:sz w:val="24"/>
-          <w:szCs w:val="24"/>
-        </w:rPr>
-        <w:t xml:space="preserve">IIT Guwahati </w:t>
-      </w:r>
-      <w:r>
-        <w:rPr>
-          <w:sz w:val="24"/>
-          <w:szCs w:val="24"/>
-        </w:rPr>
-        <w:t>(</w:t>
-      </w:r>
-      <w:r>
-        <w:rPr>
-          <w:sz w:val="24"/>
-          <w:szCs w:val="24"/>
-        </w:rPr>
-        <w:t>I</w:t>
-      </w:r>
-      <w:r>
-        <w:rPr>
-          <w:sz w:val="24"/>
-          <w:szCs w:val="24"/>
-        </w:rPr>
-        <w:t xml:space="preserve">ndian </w:t>
-      </w:r>
-      <w:r>
-        <w:rPr>
-          <w:sz w:val="24"/>
-          <w:szCs w:val="24"/>
-        </w:rPr>
-        <w:t>I</w:t>
-      </w:r>
-      <w:r>
-        <w:rPr>
-          <w:sz w:val="24"/>
-          <w:szCs w:val="24"/>
-        </w:rPr>
-        <w:t>nstitute of Technology</w:t>
-      </w:r>
-      <w:r>
-        <w:rPr>
-          <w:sz w:val="24"/>
-          <w:szCs w:val="24"/>
-        </w:rPr>
-        <w:t xml:space="preserve"> Guwahati</w:t>
-      </w:r>
-      <w:r>
-        <w:rPr>
-          <w:sz w:val="24"/>
-          <w:szCs w:val="24"/>
-        </w:rPr>
-        <w:t>)</w:t>
-      </w:r>
-      <w:r>
-        <w:rPr>
-          <w:sz w:val="24"/>
-          <w:szCs w:val="24"/>
-        </w:rPr>
-        <w:t>.</w:t>
-      </w:r>
-    </w:p>
-    <w:p>
-      <w:pPr>
-        <w:pStyle w:val="BulletPoints"/>
-        <w:numPr>
-          <w:ilvl w:val="0"/>
-          <w:numId w:val="0"/>
-        </w:numPr>
-        <w:ind w:left="720" w:firstLine="360"/>
-        <w:rPr>
-          <w:rFonts w:asciiTheme="majorHAnsi" w:hAnsiTheme="majorHAnsi"/>
-          <w:b/>
-          <w:sz w:val="24"/>
-          <w:szCs w:val="24"/>
-        </w:rPr>
-      </w:pPr>
-      <w:r>
-        <w:rPr>
-          <w:rFonts w:asciiTheme="majorHAnsi" w:hAnsiTheme="majorHAnsi"/>
-          <w:b/>
-          <w:sz w:val="24"/>
-          <w:szCs w:val="24"/>
-        </w:rPr>
-        <w:t>Duration</w:t>
-      </w:r>
-      <w:r>
-        <w:rPr>
-          <w:rFonts w:asciiTheme="majorHAnsi" w:hAnsiTheme="majorHAnsi"/>
-          <w:b/>
-          <w:sz w:val="24"/>
-          <w:szCs w:val="24"/>
-        </w:rPr>
-        <w:t>: 2010</w:t>
-      </w:r>
-      <w:r>
-        <w:rPr>
-          <w:rFonts w:asciiTheme="majorHAnsi" w:hAnsiTheme="majorHAnsi"/>
-          <w:b/>
-          <w:sz w:val="24"/>
-          <w:szCs w:val="24"/>
-        </w:rPr>
-        <w:t xml:space="preserve"> </w:t>
-      </w:r>
-      <w:r>
-        <w:rPr>
-          <w:rFonts w:asciiTheme="majorHAnsi" w:hAnsiTheme="majorHAnsi"/>
-          <w:b/>
-          <w:sz w:val="24"/>
-          <w:szCs w:val="24"/>
-        </w:rPr>
-        <w:t>–</w:t>
-      </w:r>
-      <w:r>
-        <w:rPr>
-          <w:rFonts w:asciiTheme="majorHAnsi" w:hAnsiTheme="majorHAnsi"/>
-          <w:b/>
-          <w:sz w:val="24"/>
-          <w:szCs w:val="24"/>
-        </w:rPr>
-        <w:t xml:space="preserve"> </w:t>
-      </w:r>
-      <w:r>
-        <w:rPr>
-          <w:rFonts w:asciiTheme="majorHAnsi" w:hAnsiTheme="majorHAnsi"/>
-          <w:b/>
-          <w:sz w:val="24"/>
-          <w:szCs w:val="24"/>
-        </w:rPr>
-        <w:t>2014</w:t>
       </w:r>
     </w:p>
     <w:p>
@@ -5858,6 +6125,7 @@
         <w:t xml:space="preserve"> at </w:t>
       </w:r>
       <w:hyperlink r:id="rId21" w:history="1">
+        <w:proofErr w:type="spellStart"/>
         <w:r>
           <w:rPr>
             <w:rStyle w:val="Hyperlink"/>
@@ -5867,6 +6135,7 @@
           </w:rPr>
           <w:t>npm</w:t>
         </w:r>
+        <w:proofErr w:type="spellEnd"/>
       </w:hyperlink>
       <w:r>
         <w:rPr>
@@ -5909,6 +6178,7 @@
         <w:t xml:space="preserve"> </w:t>
       </w:r>
       <w:hyperlink r:id="rId22" w:history="1">
+        <w:proofErr w:type="spellStart"/>
         <w:r>
           <w:rPr>
             <w:rStyle w:val="Hyperlink"/>
@@ -5916,8 +6186,29 @@
             <w:sz w:val="24"/>
             <w:szCs w:val="24"/>
           </w:rPr>
-          <w:t>videojs-landscape-fullscreen</w:t>
+          <w:t>videojs</w:t>
         </w:r>
+        <w:proofErr w:type="spellEnd"/>
+        <w:r>
+          <w:rPr>
+            <w:rStyle w:val="Hyperlink"/>
+            <w:rFonts w:eastAsia="MS Mincho"/>
+            <w:sz w:val="24"/>
+            <w:szCs w:val="24"/>
+          </w:rPr>
+          <w:t>-landscape-</w:t>
+        </w:r>
+        <w:proofErr w:type="spellStart"/>
+        <w:r>
+          <w:rPr>
+            <w:rStyle w:val="Hyperlink"/>
+            <w:rFonts w:eastAsia="MS Mincho"/>
+            <w:sz w:val="24"/>
+            <w:szCs w:val="24"/>
+          </w:rPr>
+          <w:t>fullscreen</w:t>
+        </w:r>
+        <w:proofErr w:type="spellEnd"/>
       </w:hyperlink>
       <w:r>
         <w:rPr>
@@ -6047,56 +6338,56 @@
         <v:path o:extrusionok="f" gradientshapeok="t" o:connecttype="rect"/>
         <o:lock v:ext="edit" aspectratio="t"/>
       </v:shapetype>
-      <v:shape id="_x0000_i1098" type="#_x0000_t75" style="width:11.4pt;height:11.4pt" o:bullet="t">
+      <v:shape id="_x0000_i1434" type="#_x0000_t75" style="width:11.4pt;height:11.4pt" o:bullet="t">
         <v:imagedata r:id="rId1" o:title="BD14578_"/>
       </v:shape>
     </w:pict>
   </w:numPicBullet>
   <w:numPicBullet w:numPicBulletId="1">
     <w:pict>
-      <v:shape id="_x0000_i1099" type="#_x0000_t75" style="width:11.4pt;height:11.4pt" o:bullet="t">
+      <v:shape id="_x0000_i1435" type="#_x0000_t75" style="width:11.4pt;height:11.4pt" o:bullet="t">
         <v:imagedata r:id="rId2" o:title="BD21375_"/>
       </v:shape>
     </w:pict>
   </w:numPicBullet>
   <w:numPicBullet w:numPicBulletId="2">
     <w:pict>
-      <v:shape id="_x0000_i1100" type="#_x0000_t75" style="width:10.8pt;height:10.8pt" o:bullet="t">
+      <v:shape id="_x0000_i1436" type="#_x0000_t75" style="width:10.8pt;height:10.8pt" o:bullet="t">
         <v:imagedata r:id="rId3" o:title="BD21297_"/>
       </v:shape>
     </w:pict>
   </w:numPicBullet>
   <w:numPicBullet w:numPicBulletId="3">
     <w:pict>
-      <v:shape id="_x0000_i1101" type="#_x0000_t75" style="width:11.4pt;height:11.4pt" o:bullet="t">
+      <v:shape id="_x0000_i1437" type="#_x0000_t75" style="width:11.4pt;height:11.4pt" o:bullet="t">
         <v:imagedata r:id="rId4" o:title="BD14753_"/>
       </v:shape>
     </w:pict>
   </w:numPicBullet>
   <w:numPicBullet w:numPicBulletId="4">
     <w:pict>
-      <v:shape id="_x0000_i1102" type="#_x0000_t75" style="width:10.8pt;height:10.8pt" o:bullet="t">
+      <v:shape id="_x0000_i1438" type="#_x0000_t75" style="width:10.8pt;height:10.8pt" o:bullet="t">
         <v:imagedata r:id="rId5" o:title="BD21504_"/>
       </v:shape>
     </w:pict>
   </w:numPicBullet>
   <w:numPicBullet w:numPicBulletId="5">
     <w:pict>
-      <v:shape id="_x0000_i1103" type="#_x0000_t75" style="width:11.4pt;height:8.4pt" o:bullet="t">
+      <v:shape id="_x0000_i1439" type="#_x0000_t75" style="width:11.4pt;height:8.4pt" o:bullet="t">
         <v:imagedata r:id="rId6" o:title="BD21299_"/>
       </v:shape>
     </w:pict>
   </w:numPicBullet>
   <w:numPicBullet w:numPicBulletId="6">
     <w:pict>
-      <v:shape id="_x0000_i1104" type="#_x0000_t75" style="width:33.6pt;height:27pt" o:bullet="t">
+      <v:shape id="_x0000_i1440" type="#_x0000_t75" style="width:33.6pt;height:27pt" o:bullet="t">
         <v:imagedata r:id="rId7" o:title="Capture"/>
       </v:shape>
     </w:pict>
   </w:numPicBullet>
   <w:numPicBullet w:numPicBulletId="7">
     <w:pict>
-      <v:shape id="_x0000_i1105" type="#_x0000_t75" style="width:15pt;height:15pt" o:bullet="t">
+      <v:shape id="_x0000_i1441" type="#_x0000_t75" style="width:15pt;height:15pt" o:bullet="t">
         <v:imagedata r:id="rId8" o:title="Capture"/>
       </v:shape>
     </w:pict>
@@ -12410,15 +12701,6 @@
 </file>
 
 <file path=customXml/item1.xml><?xml version="1.0" encoding="utf-8"?>
-<?mso-contentType ?>
-<FormTemplates xmlns="http://schemas.microsoft.com/sharepoint/v3/contenttype/forms">
-  <Display>DocumentLibraryForm</Display>
-  <Edit>AssetEditForm</Edit>
-  <New>DocumentLibraryForm</New>
-</FormTemplates>
-</file>
-
-<file path=customXml/item2.xml><?xml version="1.0" encoding="utf-8"?>
 <MonsterProperties xmlns:xsi="http://www.w3.org/2001/XMLSchema-instance" xmlns:xsd="http://www.w3.org/2001/XMLSchema" xmlns="http://schemas.monster.com/Monster/Seeker/WordResumeTemplates">
   <AtlasTagging>
     <ResumeUploadSuccessTag>monmon_EZSubmitFinalUpload_1</ResumeUploadSuccessTag>
@@ -12431,19 +12713,20 @@
 </MonsterProperties>
 </file>
 
+<file path=customXml/item2.xml><?xml version="1.0" encoding="utf-8"?>
+<?mso-contentType ?>
+<FormTemplates xmlns="http://schemas.microsoft.com/sharepoint/v3/contenttype/forms">
+  <Display>DocumentLibraryForm</Display>
+  <Edit>AssetEditForm</Edit>
+  <New>DocumentLibraryForm</New>
+</FormTemplates>
+</file>
+
 <file path=customXml/item3.xml><?xml version="1.0" encoding="utf-8"?>
 <b:Sources xmlns:b="http://schemas.openxmlformats.org/officeDocument/2006/bibliography" xmlns="http://schemas.openxmlformats.org/officeDocument/2006/bibliography" SelectedStyle="\APA.XSL" StyleName="APA"/>
 </file>
 
 <file path=customXml/itemProps1.xml><?xml version="1.0" encoding="utf-8"?>
-<ds:datastoreItem xmlns:ds="http://schemas.openxmlformats.org/officeDocument/2006/customXml" ds:itemID="{5DEE6487-3BB8-4831-A84A-EA72C011E7B1}">
-  <ds:schemaRefs>
-    <ds:schemaRef ds:uri="http://schemas.microsoft.com/sharepoint/v3/contenttype/forms"/>
-  </ds:schemaRefs>
-</ds:datastoreItem>
-</file>
-
-<file path=customXml/itemProps2.xml><?xml version="1.0" encoding="utf-8"?>
 <ds:datastoreItem xmlns:ds="http://schemas.openxmlformats.org/officeDocument/2006/customXml" ds:itemID="{6413E27A-9F10-4D79-BB65-07392FAEAA39}">
   <ds:schemaRefs>
     <ds:schemaRef ds:uri="http://www.w3.org/2001/XMLSchema"/>
@@ -12452,8 +12735,16 @@
 </ds:datastoreItem>
 </file>
 
+<file path=customXml/itemProps2.xml><?xml version="1.0" encoding="utf-8"?>
+<ds:datastoreItem xmlns:ds="http://schemas.openxmlformats.org/officeDocument/2006/customXml" ds:itemID="{5DEE6487-3BB8-4831-A84A-EA72C011E7B1}">
+  <ds:schemaRefs>
+    <ds:schemaRef ds:uri="http://schemas.microsoft.com/sharepoint/v3/contenttype/forms"/>
+  </ds:schemaRefs>
+</ds:datastoreItem>
+</file>
+
 <file path=customXml/itemProps3.xml><?xml version="1.0" encoding="utf-8"?>
-<ds:datastoreItem xmlns:ds="http://schemas.openxmlformats.org/officeDocument/2006/customXml" ds:itemID="{A34255A5-1BED-4D8F-BE7F-BE842FB824CE}">
+<ds:datastoreItem xmlns:ds="http://schemas.openxmlformats.org/officeDocument/2006/customXml" ds:itemID="{381F72B7-0DD4-453F-B2BB-2C5B37423A0F}">
   <ds:schemaRefs>
     <ds:schemaRef ds:uri="http://schemas.openxmlformats.org/officeDocument/2006/bibliography"/>
   </ds:schemaRefs>

</xml_diff>